<commit_message>
setting up for stdio and mcp inspector
</commit_message>
<xml_diff>
--- a/assessment-docs/AT2 Development Journal Template.docx
+++ b/assessment-docs/AT2 Development Journal Template.docx
@@ -7,10 +7,7 @@
         <w:pStyle w:val="Heading1"/>
       </w:pPr>
       <w:r>
-        <w:t>AT2</w:t>
-      </w:r>
-      <w:r>
-        <w:t xml:space="preserve"> Development Journal Template</w:t>
+        <w:t>AT2 Development Journal Template</w:t>
       </w:r>
     </w:p>
     <w:p>
@@ -20,21 +17,31 @@
     </w:p>
     <w:tbl>
       <w:tblPr>
-        <w:tblW w:w="0" w:type="auto"/>
+        <w:tblW w:w="11341" w:type="dxa"/>
+        <w:tblInd w:w="-1423" w:type="dxa"/>
+        <w:tblBorders>
+          <w:top w:val="single" w:sz="4" w:space="0" w:color="auto"/>
+          <w:left w:val="single" w:sz="4" w:space="0" w:color="auto"/>
+          <w:bottom w:val="single" w:sz="4" w:space="0" w:color="auto"/>
+          <w:right w:val="single" w:sz="4" w:space="0" w:color="auto"/>
+          <w:insideH w:val="single" w:sz="4" w:space="0" w:color="auto"/>
+          <w:insideV w:val="single" w:sz="4" w:space="0" w:color="auto"/>
+        </w:tblBorders>
+        <w:tblLayout w:type="fixed"/>
         <w:tblLook w:val="04A0" w:firstRow="1" w:lastRow="0" w:firstColumn="1" w:lastColumn="0" w:noHBand="0" w:noVBand="1"/>
       </w:tblPr>
       <w:tblGrid>
-        <w:gridCol w:w="1440"/>
-        <w:gridCol w:w="1440"/>
-        <w:gridCol w:w="1440"/>
-        <w:gridCol w:w="1440"/>
-        <w:gridCol w:w="1440"/>
-        <w:gridCol w:w="1440"/>
+        <w:gridCol w:w="851"/>
+        <w:gridCol w:w="1985"/>
+        <w:gridCol w:w="1559"/>
+        <w:gridCol w:w="3260"/>
+        <w:gridCol w:w="2552"/>
+        <w:gridCol w:w="1134"/>
       </w:tblGrid>
       <w:tr>
         <w:tc>
           <w:tcPr>
-            <w:tcW w:w="1440" w:type="dxa"/>
+            <w:tcW w:w="851" w:type="dxa"/>
           </w:tcPr>
           <w:p>
             <w:r>
@@ -44,7 +51,7 @@
         </w:tc>
         <w:tc>
           <w:tcPr>
-            <w:tcW w:w="1440" w:type="dxa"/>
+            <w:tcW w:w="1985" w:type="dxa"/>
           </w:tcPr>
           <w:p>
             <w:r>
@@ -54,7 +61,7 @@
         </w:tc>
         <w:tc>
           <w:tcPr>
-            <w:tcW w:w="1440" w:type="dxa"/>
+            <w:tcW w:w="1559" w:type="dxa"/>
           </w:tcPr>
           <w:p>
             <w:r>
@@ -64,7 +71,7 @@
         </w:tc>
         <w:tc>
           <w:tcPr>
-            <w:tcW w:w="1440" w:type="dxa"/>
+            <w:tcW w:w="3260" w:type="dxa"/>
           </w:tcPr>
           <w:p>
             <w:r>
@@ -74,7 +81,7 @@
         </w:tc>
         <w:tc>
           <w:tcPr>
-            <w:tcW w:w="1440" w:type="dxa"/>
+            <w:tcW w:w="2552" w:type="dxa"/>
           </w:tcPr>
           <w:p>
             <w:r>
@@ -84,7 +91,7 @@
         </w:tc>
         <w:tc>
           <w:tcPr>
-            <w:tcW w:w="1440" w:type="dxa"/>
+            <w:tcW w:w="1134" w:type="dxa"/>
           </w:tcPr>
           <w:p>
             <w:r>
@@ -96,303 +103,294 @@
       <w:tr>
         <w:tc>
           <w:tcPr>
-            <w:tcW w:w="1440" w:type="dxa"/>
+            <w:tcW w:w="851" w:type="dxa"/>
           </w:tcPr>
-          <w:p/>
+          <w:p>
+            <w:r>
+              <w:t>10/05</w:t>
+            </w:r>
+          </w:p>
         </w:tc>
         <w:tc>
           <w:tcPr>
-            <w:tcW w:w="1440" w:type="dxa"/>
+            <w:tcW w:w="1985" w:type="dxa"/>
           </w:tcPr>
-          <w:p/>
+          <w:p>
+            <w:r>
+              <w:t>Resource 1: user_inventory.csv column information</w:t>
+            </w:r>
+          </w:p>
         </w:tc>
         <w:tc>
           <w:tcPr>
-            <w:tcW w:w="1440" w:type="dxa"/>
+            <w:tcW w:w="1559" w:type="dxa"/>
           </w:tcPr>
-          <w:p/>
+          <w:p>
+            <w:r>
+              <w:t>What column headings to give to food items</w:t>
+            </w:r>
+          </w:p>
         </w:tc>
         <w:tc>
           <w:tcPr>
-            <w:tcW w:w="1440" w:type="dxa"/>
+            <w:tcW w:w="3260" w:type="dxa"/>
           </w:tcPr>
-          <w:p/>
+          <w:p>
+            <w:r>
+              <w:t>Separation of concerns with how detailed I plan to give the item inventory. Which item descriptions are most important</w:t>
+            </w:r>
+          </w:p>
         </w:tc>
         <w:tc>
           <w:tcPr>
-            <w:tcW w:w="1440" w:type="dxa"/>
+            <w:tcW w:w="2552" w:type="dxa"/>
           </w:tcPr>
-          <w:p/>
+          <w:p>
+            <w:r>
+              <w:t>Focus on item ID, basic stock count, basic nutritional information</w:t>
+            </w:r>
+          </w:p>
         </w:tc>
         <w:tc>
           <w:tcPr>
-            <w:tcW w:w="1440" w:type="dxa"/>
+            <w:tcW w:w="1134" w:type="dxa"/>
           </w:tcPr>
-          <w:p/>
+          <w:p>
+            <w:r>
+              <w:t>Commit 1 on feature-resource</w:t>
+            </w:r>
+          </w:p>
         </w:tc>
       </w:tr>
       <w:tr>
         <w:tc>
           <w:tcPr>
-            <w:tcW w:w="1440" w:type="dxa"/>
+            <w:tcW w:w="851" w:type="dxa"/>
           </w:tcPr>
-          <w:p/>
+          <w:p>
+            <w:r>
+              <w:t>10/05</w:t>
+            </w:r>
+          </w:p>
         </w:tc>
         <w:tc>
           <w:tcPr>
-            <w:tcW w:w="1440" w:type="dxa"/>
+            <w:tcW w:w="1985" w:type="dxa"/>
           </w:tcPr>
-          <w:p/>
+          <w:p>
+            <w:r>
+              <w:t>Resource 2: user_intake_history.csv column information</w:t>
+            </w:r>
+          </w:p>
         </w:tc>
         <w:tc>
           <w:tcPr>
-            <w:tcW w:w="1440" w:type="dxa"/>
+            <w:tcW w:w="1559" w:type="dxa"/>
           </w:tcPr>
-          <w:p/>
+          <w:p>
+            <w:r>
+              <w:t>What column headings to give to intake item columns</w:t>
+            </w:r>
+          </w:p>
         </w:tc>
         <w:tc>
           <w:tcPr>
-            <w:tcW w:w="1440" w:type="dxa"/>
+            <w:tcW w:w="3260" w:type="dxa"/>
           </w:tcPr>
-          <w:p/>
+          <w:p>
+            <w:r>
+              <w:t xml:space="preserve">how can I give leeway with having to perfectly measure portions for food intake, and how can I account for meals which include multiple ingredients </w:t>
+            </w:r>
+          </w:p>
         </w:tc>
         <w:tc>
           <w:tcPr>
-            <w:tcW w:w="1440" w:type="dxa"/>
+            <w:tcW w:w="2552" w:type="dxa"/>
           </w:tcPr>
-          <w:p/>
+          <w:p>
+            <w:r>
+              <w:t xml:space="preserve">Label measurable variables as estimations </w:t>
+            </w:r>
+          </w:p>
         </w:tc>
         <w:tc>
           <w:tcPr>
-            <w:tcW w:w="1440" w:type="dxa"/>
+            <w:tcW w:w="1134" w:type="dxa"/>
           </w:tcPr>
-          <w:p/>
+          <w:p>
+            <w:r>
+              <w:t xml:space="preserve">Commit 2 on feature-resource </w:t>
+            </w:r>
+          </w:p>
         </w:tc>
       </w:tr>
       <w:tr>
         <w:tc>
           <w:tcPr>
-            <w:tcW w:w="1440" w:type="dxa"/>
+            <w:tcW w:w="851" w:type="dxa"/>
           </w:tcPr>
-          <w:p/>
+          <w:p>
+            <w:r>
+              <w:t>10/05</w:t>
+            </w:r>
+          </w:p>
         </w:tc>
         <w:tc>
           <w:tcPr>
-            <w:tcW w:w="1440" w:type="dxa"/>
+            <w:tcW w:w="1985" w:type="dxa"/>
           </w:tcPr>
-          <w:p/>
+          <w:p>
+            <w:r>
+              <w:t>Resource 2: user_intake_history.csv column information handling multiple ingredient meals</w:t>
+            </w:r>
+          </w:p>
         </w:tc>
         <w:tc>
           <w:tcPr>
-            <w:tcW w:w="1440" w:type="dxa"/>
+            <w:tcW w:w="1559" w:type="dxa"/>
           </w:tcPr>
-          <w:p/>
+          <w:p>
+            <w:r>
+              <w:t xml:space="preserve">User_intake_history.csv </w:t>
+            </w:r>
+            <w:r>
+              <w:t xml:space="preserve">poorly handles meal inputs. </w:t>
+            </w:r>
+          </w:p>
         </w:tc>
         <w:tc>
           <w:tcPr>
-            <w:tcW w:w="1440" w:type="dxa"/>
+            <w:tcW w:w="3260" w:type="dxa"/>
           </w:tcPr>
-          <w:p/>
+          <w:p>
+            <w:r>
+              <w:t xml:space="preserve">Recording what foods are used in one csv file can become complex. </w:t>
+            </w:r>
+          </w:p>
+          <w:p>
+            <w:r>
+              <w:t>If user asks</w:t>
+            </w:r>
+            <w:r>
+              <w:t>: “I had chicken, rice, and broccoli”</w:t>
+            </w:r>
+            <w:r>
+              <w:t xml:space="preserve"> or “spaghetti bolognaise” it may be simpler to </w:t>
+            </w:r>
+            <w:r>
+              <w:t>input as a meal description and then further find out ingredients</w:t>
+            </w:r>
+          </w:p>
         </w:tc>
         <w:tc>
           <w:tcPr>
-            <w:tcW w:w="1440" w:type="dxa"/>
+            <w:tcW w:w="2552" w:type="dxa"/>
           </w:tcPr>
-          <w:p/>
+          <w:p>
+            <w:r>
+              <w:t>A second file to simplify csv complexity of including meals.</w:t>
+            </w:r>
+            <w:r>
+              <w:br/>
+            </w:r>
+            <w:r>
+              <w:br/>
+            </w:r>
+            <w:r>
+              <w:t>user_intake_history.csv = one row per eating event</w:t>
+            </w:r>
+          </w:p>
+          <w:p>
+            <w:r>
+              <w:t>user_intake_items.csv   = one or more rows describing what was inside that eating event</w:t>
+            </w:r>
+          </w:p>
+          <w:p>
+            <w:r>
+              <w:t>support “</w:t>
+            </w:r>
+            <w:r>
+              <w:t>Good enough now, more detail later.</w:t>
+            </w:r>
+            <w:r>
+              <w:t>” So that “I had spag bog” and “</w:t>
+            </w:r>
+            <w:r>
+              <w:t>I had 80g pasta, 125g beef mince, half a tin of tomatoes and 30g cheese</w:t>
+            </w:r>
+            <w:r>
+              <w:t>” are usable</w:t>
+            </w:r>
+          </w:p>
         </w:tc>
         <w:tc>
           <w:tcPr>
-            <w:tcW w:w="1440" w:type="dxa"/>
+            <w:tcW w:w="1134" w:type="dxa"/>
           </w:tcPr>
-          <w:p/>
+          <w:p>
+            <w:r>
+              <w:t>Commit 3 4 on feature-resource</w:t>
+            </w:r>
+          </w:p>
         </w:tc>
       </w:tr>
       <w:tr>
         <w:tc>
           <w:tcPr>
-            <w:tcW w:w="1440" w:type="dxa"/>
+            <w:tcW w:w="851" w:type="dxa"/>
           </w:tcPr>
-          <w:p/>
+          <w:p>
+            <w:r>
+              <w:t>10/05</w:t>
+            </w:r>
+          </w:p>
         </w:tc>
         <w:tc>
           <w:tcPr>
-            <w:tcW w:w="1440" w:type="dxa"/>
+            <w:tcW w:w="1985" w:type="dxa"/>
           </w:tcPr>
-          <w:p/>
+          <w:p>
+            <w:r>
+              <w:t>Test/debug resource using stdio</w:t>
+            </w:r>
+          </w:p>
         </w:tc>
         <w:tc>
           <w:tcPr>
-            <w:tcW w:w="1440" w:type="dxa"/>
+            <w:tcW w:w="1559" w:type="dxa"/>
           </w:tcPr>
-          <w:p/>
+          <w:p>
+            <w:r>
+              <w:t>Test current resource implementation using stdio</w:t>
+            </w:r>
+          </w:p>
         </w:tc>
         <w:tc>
           <w:tcPr>
-            <w:tcW w:w="1440" w:type="dxa"/>
+            <w:tcW w:w="3260" w:type="dxa"/>
           </w:tcPr>
-          <w:p/>
+          <w:p>
+            <w:r>
+              <w:t>Modules not found when importing .py files</w:t>
+            </w:r>
+            <w:r>
+              <w:t xml:space="preserve"> when running stdio.py.</w:t>
+            </w:r>
+          </w:p>
         </w:tc>
         <w:tc>
           <w:tcPr>
-            <w:tcW w:w="1440" w:type="dxa"/>
+            <w:tcW w:w="2552" w:type="dxa"/>
           </w:tcPr>
-          <w:p/>
+          <w:p>
+            <w:r>
+              <w:t xml:space="preserve">Used init files and folder structure setup. Deleting cashe </w:t>
+            </w:r>
+          </w:p>
         </w:tc>
         <w:tc>
           <w:tcPr>
-            <w:tcW w:w="1440" w:type="dxa"/>
-          </w:tcPr>
-          <w:p/>
-        </w:tc>
-      </w:tr>
-      <w:tr>
-        <w:tc>
-          <w:tcPr>
-            <w:tcW w:w="1440" w:type="dxa"/>
-          </w:tcPr>
-          <w:p/>
-        </w:tc>
-        <w:tc>
-          <w:tcPr>
-            <w:tcW w:w="1440" w:type="dxa"/>
-          </w:tcPr>
-          <w:p/>
-        </w:tc>
-        <w:tc>
-          <w:tcPr>
-            <w:tcW w:w="1440" w:type="dxa"/>
-          </w:tcPr>
-          <w:p/>
-        </w:tc>
-        <w:tc>
-          <w:tcPr>
-            <w:tcW w:w="1440" w:type="dxa"/>
-          </w:tcPr>
-          <w:p/>
-        </w:tc>
-        <w:tc>
-          <w:tcPr>
-            <w:tcW w:w="1440" w:type="dxa"/>
-          </w:tcPr>
-          <w:p/>
-        </w:tc>
-        <w:tc>
-          <w:tcPr>
-            <w:tcW w:w="1440" w:type="dxa"/>
-          </w:tcPr>
-          <w:p/>
-        </w:tc>
-      </w:tr>
-      <w:tr>
-        <w:tc>
-          <w:tcPr>
-            <w:tcW w:w="1440" w:type="dxa"/>
-          </w:tcPr>
-          <w:p/>
-        </w:tc>
-        <w:tc>
-          <w:tcPr>
-            <w:tcW w:w="1440" w:type="dxa"/>
-          </w:tcPr>
-          <w:p/>
-        </w:tc>
-        <w:tc>
-          <w:tcPr>
-            <w:tcW w:w="1440" w:type="dxa"/>
-          </w:tcPr>
-          <w:p/>
-        </w:tc>
-        <w:tc>
-          <w:tcPr>
-            <w:tcW w:w="1440" w:type="dxa"/>
-          </w:tcPr>
-          <w:p/>
-        </w:tc>
-        <w:tc>
-          <w:tcPr>
-            <w:tcW w:w="1440" w:type="dxa"/>
-          </w:tcPr>
-          <w:p/>
-        </w:tc>
-        <w:tc>
-          <w:tcPr>
-            <w:tcW w:w="1440" w:type="dxa"/>
-          </w:tcPr>
-          <w:p/>
-        </w:tc>
-      </w:tr>
-      <w:tr>
-        <w:tc>
-          <w:tcPr>
-            <w:tcW w:w="1440" w:type="dxa"/>
-          </w:tcPr>
-          <w:p/>
-        </w:tc>
-        <w:tc>
-          <w:tcPr>
-            <w:tcW w:w="1440" w:type="dxa"/>
-          </w:tcPr>
-          <w:p/>
-        </w:tc>
-        <w:tc>
-          <w:tcPr>
-            <w:tcW w:w="1440" w:type="dxa"/>
-          </w:tcPr>
-          <w:p/>
-        </w:tc>
-        <w:tc>
-          <w:tcPr>
-            <w:tcW w:w="1440" w:type="dxa"/>
-          </w:tcPr>
-          <w:p/>
-        </w:tc>
-        <w:tc>
-          <w:tcPr>
-            <w:tcW w:w="1440" w:type="dxa"/>
-          </w:tcPr>
-          <w:p/>
-        </w:tc>
-        <w:tc>
-          <w:tcPr>
-            <w:tcW w:w="1440" w:type="dxa"/>
-          </w:tcPr>
-          <w:p/>
-        </w:tc>
-      </w:tr>
-      <w:tr>
-        <w:tc>
-          <w:tcPr>
-            <w:tcW w:w="1440" w:type="dxa"/>
-          </w:tcPr>
-          <w:p/>
-        </w:tc>
-        <w:tc>
-          <w:tcPr>
-            <w:tcW w:w="1440" w:type="dxa"/>
-          </w:tcPr>
-          <w:p/>
-        </w:tc>
-        <w:tc>
-          <w:tcPr>
-            <w:tcW w:w="1440" w:type="dxa"/>
-          </w:tcPr>
-          <w:p/>
-        </w:tc>
-        <w:tc>
-          <w:tcPr>
-            <w:tcW w:w="1440" w:type="dxa"/>
-          </w:tcPr>
-          <w:p/>
-        </w:tc>
-        <w:tc>
-          <w:tcPr>
-            <w:tcW w:w="1440" w:type="dxa"/>
-          </w:tcPr>
-          <w:p/>
-        </w:tc>
-        <w:tc>
-          <w:tcPr>
-            <w:tcW w:w="1440" w:type="dxa"/>
+            <w:tcW w:w="1134" w:type="dxa"/>
           </w:tcPr>
           <w:p/>
         </w:tc>
@@ -1314,7 +1312,6 @@
   <w:style w:type="character" w:default="1" w:styleId="DefaultParagraphFont">
     <w:name w:val="Default Paragraph Font"/>
     <w:uiPriority w:val="1"/>
-    <w:semiHidden/>
     <w:unhideWhenUsed/>
   </w:style>
   <w:style w:type="table" w:default="1" w:styleId="TableNormal">

</xml_diff>

<commit_message>
doc updates - journal same again
</commit_message>
<xml_diff>
--- a/assessment-docs/AT2 Development Journal Template.docx
+++ b/assessment-docs/AT2 Development Journal Template.docx
@@ -32,11 +32,12 @@
       </w:tblPr>
       <w:tblGrid>
         <w:gridCol w:w="851"/>
-        <w:gridCol w:w="1985"/>
+        <w:gridCol w:w="993"/>
+        <w:gridCol w:w="283"/>
+        <w:gridCol w:w="992"/>
+        <w:gridCol w:w="2835"/>
+        <w:gridCol w:w="3828"/>
         <w:gridCol w:w="1559"/>
-        <w:gridCol w:w="3260"/>
-        <w:gridCol w:w="2552"/>
-        <w:gridCol w:w="1134"/>
       </w:tblGrid>
       <w:tr>
         <w:tc>
@@ -51,47 +52,48 @@
         </w:tc>
         <w:tc>
           <w:tcPr>
-            <w:tcW w:w="1985" w:type="dxa"/>
+            <w:tcW w:w="1276" w:type="dxa"/>
+            <w:gridSpan w:val="2"/>
           </w:tcPr>
           <w:p>
             <w:r>
               <w:t>Task</w:t>
+            </w:r>
+          </w:p>
+        </w:tc>
+        <w:tc>
+          <w:tcPr>
+            <w:tcW w:w="992" w:type="dxa"/>
+          </w:tcPr>
+          <w:p>
+            <w:r>
+              <w:t>Description</w:t>
+            </w:r>
+          </w:p>
+        </w:tc>
+        <w:tc>
+          <w:tcPr>
+            <w:tcW w:w="2835" w:type="dxa"/>
+          </w:tcPr>
+          <w:p>
+            <w:r>
+              <w:t>Problem Encountered</w:t>
+            </w:r>
+          </w:p>
+        </w:tc>
+        <w:tc>
+          <w:tcPr>
+            <w:tcW w:w="3828" w:type="dxa"/>
+          </w:tcPr>
+          <w:p>
+            <w:r>
+              <w:t>Solution</w:t>
             </w:r>
           </w:p>
         </w:tc>
         <w:tc>
           <w:tcPr>
             <w:tcW w:w="1559" w:type="dxa"/>
-          </w:tcPr>
-          <w:p>
-            <w:r>
-              <w:t>Description</w:t>
-            </w:r>
-          </w:p>
-        </w:tc>
-        <w:tc>
-          <w:tcPr>
-            <w:tcW w:w="3260" w:type="dxa"/>
-          </w:tcPr>
-          <w:p>
-            <w:r>
-              <w:t>Problem Encountered</w:t>
-            </w:r>
-          </w:p>
-        </w:tc>
-        <w:tc>
-          <w:tcPr>
-            <w:tcW w:w="2552" w:type="dxa"/>
-          </w:tcPr>
-          <w:p>
-            <w:r>
-              <w:t>Solution</w:t>
-            </w:r>
-          </w:p>
-        </w:tc>
-        <w:tc>
-          <w:tcPr>
-            <w:tcW w:w="1134" w:type="dxa"/>
           </w:tcPr>
           <w:p>
             <w:r>
@@ -113,47 +115,48 @@
         </w:tc>
         <w:tc>
           <w:tcPr>
-            <w:tcW w:w="1985" w:type="dxa"/>
+            <w:tcW w:w="1276" w:type="dxa"/>
+            <w:gridSpan w:val="2"/>
           </w:tcPr>
           <w:p>
             <w:r>
               <w:t>Resource 1: user_inventory.csv column information</w:t>
+            </w:r>
+          </w:p>
+        </w:tc>
+        <w:tc>
+          <w:tcPr>
+            <w:tcW w:w="992" w:type="dxa"/>
+          </w:tcPr>
+          <w:p>
+            <w:r>
+              <w:t>What column headings to give to food items</w:t>
+            </w:r>
+          </w:p>
+        </w:tc>
+        <w:tc>
+          <w:tcPr>
+            <w:tcW w:w="2835" w:type="dxa"/>
+          </w:tcPr>
+          <w:p>
+            <w:r>
+              <w:t>Separation of concerns with how detailed I plan to give the item inventory. Which item descriptions are most important</w:t>
+            </w:r>
+          </w:p>
+        </w:tc>
+        <w:tc>
+          <w:tcPr>
+            <w:tcW w:w="3828" w:type="dxa"/>
+          </w:tcPr>
+          <w:p>
+            <w:r>
+              <w:t>Focus on item ID, basic stock count, basic nutritional information</w:t>
             </w:r>
           </w:p>
         </w:tc>
         <w:tc>
           <w:tcPr>
             <w:tcW w:w="1559" w:type="dxa"/>
-          </w:tcPr>
-          <w:p>
-            <w:r>
-              <w:t>What column headings to give to food items</w:t>
-            </w:r>
-          </w:p>
-        </w:tc>
-        <w:tc>
-          <w:tcPr>
-            <w:tcW w:w="3260" w:type="dxa"/>
-          </w:tcPr>
-          <w:p>
-            <w:r>
-              <w:t>Separation of concerns with how detailed I plan to give the item inventory. Which item descriptions are most important</w:t>
-            </w:r>
-          </w:p>
-        </w:tc>
-        <w:tc>
-          <w:tcPr>
-            <w:tcW w:w="2552" w:type="dxa"/>
-          </w:tcPr>
-          <w:p>
-            <w:r>
-              <w:t>Focus on item ID, basic stock count, basic nutritional information</w:t>
-            </w:r>
-          </w:p>
-        </w:tc>
-        <w:tc>
-          <w:tcPr>
-            <w:tcW w:w="1134" w:type="dxa"/>
           </w:tcPr>
           <w:p>
             <w:r>
@@ -175,47 +178,48 @@
         </w:tc>
         <w:tc>
           <w:tcPr>
-            <w:tcW w:w="1985" w:type="dxa"/>
+            <w:tcW w:w="1276" w:type="dxa"/>
+            <w:gridSpan w:val="2"/>
           </w:tcPr>
           <w:p>
             <w:r>
               <w:t>Resource 2: user_intake_history.csv column information</w:t>
+            </w:r>
+          </w:p>
+        </w:tc>
+        <w:tc>
+          <w:tcPr>
+            <w:tcW w:w="992" w:type="dxa"/>
+          </w:tcPr>
+          <w:p>
+            <w:r>
+              <w:t>What column headings to give to intake item columns</w:t>
+            </w:r>
+          </w:p>
+        </w:tc>
+        <w:tc>
+          <w:tcPr>
+            <w:tcW w:w="2835" w:type="dxa"/>
+          </w:tcPr>
+          <w:p>
+            <w:r>
+              <w:t xml:space="preserve">how can I give leeway with having to perfectly measure portions for food intake, and how can I account for meals which include multiple ingredients </w:t>
+            </w:r>
+          </w:p>
+        </w:tc>
+        <w:tc>
+          <w:tcPr>
+            <w:tcW w:w="3828" w:type="dxa"/>
+          </w:tcPr>
+          <w:p>
+            <w:r>
+              <w:t xml:space="preserve">Label measurable variables as estimations </w:t>
             </w:r>
           </w:p>
         </w:tc>
         <w:tc>
           <w:tcPr>
             <w:tcW w:w="1559" w:type="dxa"/>
-          </w:tcPr>
-          <w:p>
-            <w:r>
-              <w:t>What column headings to give to intake item columns</w:t>
-            </w:r>
-          </w:p>
-        </w:tc>
-        <w:tc>
-          <w:tcPr>
-            <w:tcW w:w="3260" w:type="dxa"/>
-          </w:tcPr>
-          <w:p>
-            <w:r>
-              <w:t xml:space="preserve">how can I give leeway with having to perfectly measure portions for food intake, and how can I account for meals which include multiple ingredients </w:t>
-            </w:r>
-          </w:p>
-        </w:tc>
-        <w:tc>
-          <w:tcPr>
-            <w:tcW w:w="2552" w:type="dxa"/>
-          </w:tcPr>
-          <w:p>
-            <w:r>
-              <w:t xml:space="preserve">Label measurable variables as estimations </w:t>
-            </w:r>
-          </w:p>
-        </w:tc>
-        <w:tc>
-          <w:tcPr>
-            <w:tcW w:w="1134" w:type="dxa"/>
           </w:tcPr>
           <w:p>
             <w:r>
@@ -237,95 +241,99 @@
         </w:tc>
         <w:tc>
           <w:tcPr>
-            <w:tcW w:w="1985" w:type="dxa"/>
+            <w:tcW w:w="1276" w:type="dxa"/>
+            <w:gridSpan w:val="2"/>
           </w:tcPr>
           <w:p>
             <w:r>
               <w:t>Resource 2: user_intake_history.csv column information handling multiple ingredient meals</w:t>
+            </w:r>
+          </w:p>
+        </w:tc>
+        <w:tc>
+          <w:tcPr>
+            <w:tcW w:w="992" w:type="dxa"/>
+          </w:tcPr>
+          <w:p>
+            <w:r>
+              <w:t xml:space="preserve">User_intake_history.csv poorly handles meal inputs. </w:t>
+            </w:r>
+          </w:p>
+        </w:tc>
+        <w:tc>
+          <w:tcPr>
+            <w:tcW w:w="2835" w:type="dxa"/>
+          </w:tcPr>
+          <w:p>
+            <w:r>
+              <w:t xml:space="preserve">Recording what foods are used in one csv file can become complex. </w:t>
+            </w:r>
+          </w:p>
+          <w:p>
+            <w:r>
+              <w:t>If user asks</w:t>
+            </w:r>
+            <w:r>
+              <w:t>: “I had chicken, rice, and broccoli”</w:t>
+            </w:r>
+            <w:r>
+              <w:t xml:space="preserve"> or “spaghetti bolognaise” it may be simpler to </w:t>
+            </w:r>
+            <w:r>
+              <w:t>input as a meal description and then further find out ingredients</w:t>
+            </w:r>
+          </w:p>
+        </w:tc>
+        <w:tc>
+          <w:tcPr>
+            <w:tcW w:w="3828" w:type="dxa"/>
+          </w:tcPr>
+          <w:p>
+            <w:r>
+              <w:t>A second file to simplify csv complexity of including meals.</w:t>
+            </w:r>
+            <w:r>
+              <w:br/>
+            </w:r>
+            <w:r>
+              <w:br/>
+              <w:t>user_intake_history.csv = one row per eating event</w:t>
+            </w:r>
+          </w:p>
+          <w:p>
+            <w:r>
+              <w:t>user_intake_items.csv   = one or more rows describing what was inside that eating event</w:t>
+            </w:r>
+          </w:p>
+          <w:p>
+            <w:r>
+              <w:t>support “</w:t>
+            </w:r>
+            <w:r>
+              <w:t>Good enough now, more detail later.</w:t>
+            </w:r>
+            <w:r>
+              <w:t xml:space="preserve">” So that “I had </w:t>
+            </w:r>
+            <w:proofErr w:type="spellStart"/>
+            <w:r>
+              <w:t>spag</w:t>
+            </w:r>
+            <w:proofErr w:type="spellEnd"/>
+            <w:r>
+              <w:t xml:space="preserve"> bog” and “</w:t>
+            </w:r>
+            <w:r>
+              <w:t>I had 80g pasta, 125g beef mince, half a tin of tomatoes and 30g cheese</w:t>
+            </w:r>
+            <w:r>
+              <w:t>” are usable</w:t>
             </w:r>
           </w:p>
         </w:tc>
         <w:tc>
           <w:tcPr>
             <w:tcW w:w="1559" w:type="dxa"/>
-          </w:tcPr>
-          <w:p>
-            <w:r>
-              <w:t xml:space="preserve">User_intake_history.csv </w:t>
-            </w:r>
-            <w:r>
-              <w:t xml:space="preserve">poorly handles meal inputs. </w:t>
-            </w:r>
-          </w:p>
-        </w:tc>
-        <w:tc>
-          <w:tcPr>
-            <w:tcW w:w="3260" w:type="dxa"/>
-          </w:tcPr>
-          <w:p>
-            <w:r>
-              <w:t xml:space="preserve">Recording what foods are used in one csv file can become complex. </w:t>
-            </w:r>
-          </w:p>
-          <w:p>
-            <w:r>
-              <w:t>If user asks</w:t>
-            </w:r>
-            <w:r>
-              <w:t>: “I had chicken, rice, and broccoli”</w:t>
-            </w:r>
-            <w:r>
-              <w:t xml:space="preserve"> or “spaghetti bolognaise” it may be simpler to </w:t>
-            </w:r>
-            <w:r>
-              <w:t>input as a meal description and then further find out ingredients</w:t>
-            </w:r>
-          </w:p>
-        </w:tc>
-        <w:tc>
-          <w:tcPr>
-            <w:tcW w:w="2552" w:type="dxa"/>
-          </w:tcPr>
-          <w:p>
-            <w:r>
-              <w:t>A second file to simplify csv complexity of including meals.</w:t>
-            </w:r>
-            <w:r>
-              <w:br/>
-            </w:r>
-            <w:r>
-              <w:br/>
-            </w:r>
-            <w:r>
-              <w:t>user_intake_history.csv = one row per eating event</w:t>
-            </w:r>
-          </w:p>
-          <w:p>
-            <w:r>
-              <w:t>user_intake_items.csv   = one or more rows describing what was inside that eating event</w:t>
-            </w:r>
-          </w:p>
-          <w:p>
-            <w:r>
-              <w:t>support “</w:t>
-            </w:r>
-            <w:r>
-              <w:t>Good enough now, more detail later.</w:t>
-            </w:r>
-            <w:r>
-              <w:t>” So that “I had spag bog” and “</w:t>
-            </w:r>
-            <w:r>
-              <w:t>I had 80g pasta, 125g beef mince, half a tin of tomatoes and 30g cheese</w:t>
-            </w:r>
-            <w:r>
-              <w:t>” are usable</w:t>
-            </w:r>
-          </w:p>
-        </w:tc>
-        <w:tc>
-          <w:tcPr>
-            <w:tcW w:w="1134" w:type="dxa"/>
           </w:tcPr>
           <w:p>
             <w:r>
@@ -347,11 +355,116 @@
         </w:tc>
         <w:tc>
           <w:tcPr>
-            <w:tcW w:w="1985" w:type="dxa"/>
+            <w:tcW w:w="1276" w:type="dxa"/>
+            <w:gridSpan w:val="2"/>
           </w:tcPr>
           <w:p>
             <w:r>
-              <w:t>Test/debug resource using stdio</w:t>
+              <w:t xml:space="preserve">Test/debug resource using </w:t>
+            </w:r>
+            <w:proofErr w:type="spellStart"/>
+            <w:r>
+              <w:t>stdio</w:t>
+            </w:r>
+            <w:proofErr w:type="spellEnd"/>
+          </w:p>
+        </w:tc>
+        <w:tc>
+          <w:tcPr>
+            <w:tcW w:w="992" w:type="dxa"/>
+          </w:tcPr>
+          <w:p>
+            <w:r>
+              <w:t>Test current resourc</w:t>
+            </w:r>
+            <w:r>
+              <w:lastRenderedPageBreak/>
+              <w:t xml:space="preserve">e implementation using </w:t>
+            </w:r>
+            <w:proofErr w:type="spellStart"/>
+            <w:r>
+              <w:t>stdio</w:t>
+            </w:r>
+            <w:proofErr w:type="spellEnd"/>
+            <w:r>
+              <w:t xml:space="preserve"> using </w:t>
+            </w:r>
+            <w:proofErr w:type="spellStart"/>
+            <w:r>
+              <w:t>mcp</w:t>
+            </w:r>
+            <w:proofErr w:type="spellEnd"/>
+            <w:r>
+              <w:t xml:space="preserve"> inspector </w:t>
+            </w:r>
+          </w:p>
+        </w:tc>
+        <w:tc>
+          <w:tcPr>
+            <w:tcW w:w="2835" w:type="dxa"/>
+          </w:tcPr>
+          <w:p>
+            <w:r>
+              <w:lastRenderedPageBreak/>
+              <w:t>Modules not found when importing .</w:t>
+            </w:r>
+            <w:proofErr w:type="spellStart"/>
+            <w:r>
+              <w:t>py</w:t>
+            </w:r>
+            <w:proofErr w:type="spellEnd"/>
+            <w:r>
+              <w:t xml:space="preserve"> files</w:t>
+            </w:r>
+            <w:r>
+              <w:t xml:space="preserve"> when </w:t>
+            </w:r>
+            <w:r>
+              <w:lastRenderedPageBreak/>
+              <w:t>running stdio.py.</w:t>
+            </w:r>
+            <w:r>
+              <w:t xml:space="preserve"> </w:t>
+            </w:r>
+            <w:proofErr w:type="spellStart"/>
+            <w:r>
+              <w:t>mcp</w:t>
+            </w:r>
+            <w:proofErr w:type="spellEnd"/>
+            <w:r>
+              <w:t xml:space="preserve"> inspector errors.</w:t>
+            </w:r>
+          </w:p>
+          <w:p>
+            <w:r>
+              <w:t xml:space="preserve"> </w:t>
+            </w:r>
+          </w:p>
+        </w:tc>
+        <w:tc>
+          <w:tcPr>
+            <w:tcW w:w="3828" w:type="dxa"/>
+          </w:tcPr>
+          <w:p>
+            <w:r>
+              <w:lastRenderedPageBreak/>
+              <w:t xml:space="preserve">Used </w:t>
+            </w:r>
+            <w:proofErr w:type="spellStart"/>
+            <w:r>
+              <w:t>init</w:t>
+            </w:r>
+            <w:proofErr w:type="spellEnd"/>
+            <w:r>
+              <w:t xml:space="preserve"> files and folder structure setup. Deleting </w:t>
+            </w:r>
+            <w:proofErr w:type="spellStart"/>
+            <w:r>
+              <w:t>cashe</w:t>
+            </w:r>
+            <w:proofErr w:type="spellEnd"/>
+            <w:r>
+              <w:t xml:space="preserve"> </w:t>
             </w:r>
           </w:p>
         </w:tc>
@@ -361,36 +474,2649 @@
           </w:tcPr>
           <w:p>
             <w:r>
-              <w:t>Test current resource implementation using stdio</w:t>
+              <w:t>Successful merged feature-</w:t>
+            </w:r>
+            <w:r>
+              <w:lastRenderedPageBreak/>
+              <w:t>resource branch into main</w:t>
+            </w:r>
+          </w:p>
+        </w:tc>
+      </w:tr>
+      <w:tr>
+        <w:tc>
+          <w:tcPr>
+            <w:tcW w:w="11341" w:type="dxa"/>
+            <w:gridSpan w:val="7"/>
+          </w:tcPr>
+          <w:p>
+            <w:pPr>
+              <w:rPr>
+                <w:b/>
+                <w:bCs/>
+              </w:rPr>
+            </w:pPr>
+            <w:r>
+              <w:rPr>
+                <w:b/>
+                <w:bCs/>
+              </w:rPr>
+              <w:lastRenderedPageBreak/>
+              <w:t>Testing goals</w:t>
+            </w:r>
+          </w:p>
+          <w:tbl>
+            <w:tblPr>
+              <w:tblW w:w="11144" w:type="dxa"/>
+              <w:tblCellSpacing w:w="15" w:type="dxa"/>
+              <w:tblBorders>
+                <w:top w:val="single" w:sz="4" w:space="0" w:color="auto"/>
+                <w:left w:val="single" w:sz="4" w:space="0" w:color="auto"/>
+                <w:bottom w:val="single" w:sz="4" w:space="0" w:color="auto"/>
+                <w:right w:val="single" w:sz="4" w:space="0" w:color="auto"/>
+                <w:insideH w:val="single" w:sz="4" w:space="0" w:color="auto"/>
+                <w:insideV w:val="single" w:sz="4" w:space="0" w:color="auto"/>
+              </w:tblBorders>
+              <w:tblCellMar>
+                <w:top w:w="15" w:type="dxa"/>
+                <w:left w:w="15" w:type="dxa"/>
+                <w:bottom w:w="15" w:type="dxa"/>
+                <w:right w:w="15" w:type="dxa"/>
+              </w:tblCellMar>
+              <w:tblLook w:val="04A0" w:firstRow="1" w:lastRow="0" w:firstColumn="1" w:lastColumn="0" w:noHBand="0" w:noVBand="1"/>
+            </w:tblPr>
+            <w:tblGrid>
+              <w:gridCol w:w="4823"/>
+              <w:gridCol w:w="6321"/>
+            </w:tblGrid>
+            <w:tr>
+              <w:trPr>
+                <w:trHeight w:val="245"/>
+                <w:tblHeader/>
+                <w:tblCellSpacing w:w="15" w:type="dxa"/>
+              </w:trPr>
+              <w:tc>
+                <w:tcPr>
+                  <w:tcW w:w="4778" w:type="dxa"/>
+                  <w:vAlign w:val="center"/>
+                  <w:hideMark/>
+                </w:tcPr>
+                <w:p>
+                  <w:pPr>
+                    <w:rPr>
+                      <w:b/>
+                      <w:bCs/>
+                    </w:rPr>
+                  </w:pPr>
+                  <w:r>
+                    <w:rPr>
+                      <w:b/>
+                      <w:bCs/>
+                    </w:rPr>
+                    <w:t>Goal</w:t>
+                  </w:r>
+                </w:p>
+              </w:tc>
+              <w:tc>
+                <w:tcPr>
+                  <w:tcW w:w="6276" w:type="dxa"/>
+                  <w:vAlign w:val="center"/>
+                  <w:hideMark/>
+                </w:tcPr>
+                <w:p>
+                  <w:pPr>
+                    <w:rPr>
+                      <w:b/>
+                      <w:bCs/>
+                    </w:rPr>
+                  </w:pPr>
+                  <w:r>
+                    <w:rPr>
+                      <w:b/>
+                      <w:bCs/>
+                    </w:rPr>
+                    <w:t>Meaning</w:t>
+                  </w:r>
+                </w:p>
+              </w:tc>
+            </w:tr>
+            <w:tr>
+              <w:trPr>
+                <w:trHeight w:val="251"/>
+                <w:tblCellSpacing w:w="15" w:type="dxa"/>
+              </w:trPr>
+              <w:tc>
+                <w:tcPr>
+                  <w:tcW w:w="4778" w:type="dxa"/>
+                  <w:vAlign w:val="center"/>
+                  <w:hideMark/>
+                </w:tcPr>
+                <w:p>
+                  <w:r>
+                    <w:t>The project can find files</w:t>
+                  </w:r>
+                </w:p>
+              </w:tc>
+              <w:tc>
+                <w:tcPr>
+                  <w:tcW w:w="6276" w:type="dxa"/>
+                  <w:vAlign w:val="center"/>
+                  <w:hideMark/>
+                </w:tcPr>
+                <w:p>
+                  <w:r>
+                    <w:t>Paths to CSV and text resources are correct</w:t>
+                  </w:r>
+                </w:p>
+              </w:tc>
+            </w:tr>
+            <w:tr>
+              <w:trPr>
+                <w:trHeight w:val="251"/>
+                <w:tblCellSpacing w:w="15" w:type="dxa"/>
+              </w:trPr>
+              <w:tc>
+                <w:tcPr>
+                  <w:tcW w:w="4778" w:type="dxa"/>
+                  <w:vAlign w:val="center"/>
+                  <w:hideMark/>
+                </w:tcPr>
+                <w:p>
+                  <w:r>
+                    <w:t>The CSV files can be read</w:t>
+                  </w:r>
+                </w:p>
+              </w:tc>
+              <w:tc>
+                <w:tcPr>
+                  <w:tcW w:w="6276" w:type="dxa"/>
+                  <w:vAlign w:val="center"/>
+                  <w:hideMark/>
+                </w:tcPr>
+                <w:p>
+                  <w:r>
+                    <w:t>Inventory and intake files load without crashing</w:t>
+                  </w:r>
+                </w:p>
+              </w:tc>
+            </w:tr>
+            <w:tr>
+              <w:trPr>
+                <w:trHeight w:val="245"/>
+                <w:tblCellSpacing w:w="15" w:type="dxa"/>
+              </w:trPr>
+              <w:tc>
+                <w:tcPr>
+                  <w:tcW w:w="4778" w:type="dxa"/>
+                  <w:vAlign w:val="center"/>
+                  <w:hideMark/>
+                </w:tcPr>
+                <w:p>
+                  <w:r>
+                    <w:t>The data shape is usable</w:t>
+                  </w:r>
+                </w:p>
+              </w:tc>
+              <w:tc>
+                <w:tcPr>
+                  <w:tcW w:w="6276" w:type="dxa"/>
+                  <w:vAlign w:val="center"/>
+                  <w:hideMark/>
+                </w:tcPr>
+                <w:p>
+                  <w:r>
+                    <w:t>Required columns exist</w:t>
+                  </w:r>
+                </w:p>
+              </w:tc>
+            </w:tr>
+            <w:tr>
+              <w:trPr>
+                <w:trHeight w:val="251"/>
+                <w:tblCellSpacing w:w="15" w:type="dxa"/>
+              </w:trPr>
+              <w:tc>
+                <w:tcPr>
+                  <w:tcW w:w="4778" w:type="dxa"/>
+                  <w:vAlign w:val="center"/>
+                  <w:hideMark/>
+                </w:tcPr>
+                <w:p>
+                  <w:r>
+                    <w:t>Resource responses are valid</w:t>
+                  </w:r>
+                </w:p>
+              </w:tc>
+              <w:tc>
+                <w:tcPr>
+                  <w:tcW w:w="6276" w:type="dxa"/>
+                  <w:vAlign w:val="center"/>
+                  <w:hideMark/>
+                </w:tcPr>
+                <w:p>
+                  <w:r>
+                    <w:t>MCP resources return clean strings/JSON</w:t>
+                  </w:r>
+                </w:p>
+              </w:tc>
+            </w:tr>
+            <w:tr>
+              <w:trPr>
+                <w:trHeight w:val="251"/>
+                <w:tblCellSpacing w:w="15" w:type="dxa"/>
+              </w:trPr>
+              <w:tc>
+                <w:tcPr>
+                  <w:tcW w:w="4778" w:type="dxa"/>
+                  <w:vAlign w:val="center"/>
+                  <w:hideMark/>
+                </w:tcPr>
+                <w:p>
+                  <w:r>
+                    <w:t>Errors are visible</w:t>
+                  </w:r>
+                </w:p>
+              </w:tc>
+              <w:tc>
+                <w:tcPr>
+                  <w:tcW w:w="6276" w:type="dxa"/>
+                  <w:vAlign w:val="center"/>
+                  <w:hideMark/>
+                </w:tcPr>
+                <w:p>
+                  <w:r>
+                    <w:t>Problems are written to logs</w:t>
+                  </w:r>
+                </w:p>
+              </w:tc>
+            </w:tr>
+            <w:tr>
+              <w:trPr>
+                <w:trHeight w:val="245"/>
+                <w:tblCellSpacing w:w="15" w:type="dxa"/>
+              </w:trPr>
+              <w:tc>
+                <w:tcPr>
+                  <w:tcW w:w="4778" w:type="dxa"/>
+                  <w:vAlign w:val="center"/>
+                  <w:hideMark/>
+                </w:tcPr>
+                <w:p>
+                  <w:r>
+                    <w:t>MCP Inspector can access resources</w:t>
+                  </w:r>
+                </w:p>
+              </w:tc>
+              <w:tc>
+                <w:tcPr>
+                  <w:tcW w:w="6276" w:type="dxa"/>
+                  <w:vAlign w:val="center"/>
+                  <w:hideMark/>
+                </w:tcPr>
+                <w:p>
+                  <w:r>
+                    <w:t>The server works from a real MCP client</w:t>
+                  </w:r>
+                </w:p>
+              </w:tc>
+            </w:tr>
+          </w:tbl>
+          <w:p/>
+          <w:p>
+            <w:pPr>
+              <w:rPr>
+                <w:b/>
+                <w:bCs/>
+              </w:rPr>
+            </w:pPr>
+            <w:r>
+              <w:rPr>
+                <w:b/>
+                <w:bCs/>
+              </w:rPr>
+              <w:t>test_paths.py</w:t>
+            </w:r>
+          </w:p>
+          <w:p>
+            <w:r>
+              <w:t>Does the data directory exist?</w:t>
+            </w:r>
+          </w:p>
+          <w:p>
+            <w:r>
+              <w:t>Does user_inventory.csv exist?</w:t>
+            </w:r>
+          </w:p>
+          <w:p>
+            <w:r>
+              <w:t>Does user_intake_history.csv exist?</w:t>
+            </w:r>
+          </w:p>
+          <w:p>
+            <w:r>
+              <w:t>Does user_intake_items.csv exist?</w:t>
+            </w:r>
+          </w:p>
+          <w:p>
+            <w:r>
+              <w:t>Does the logs directory path point to logs?</w:t>
+            </w:r>
+          </w:p>
+          <w:p/>
+          <w:p>
+            <w:pPr>
+              <w:rPr>
+                <w:b/>
+                <w:bCs/>
+              </w:rPr>
+            </w:pPr>
+            <w:r>
+              <w:rPr>
+                <w:b/>
+                <w:bCs/>
+              </w:rPr>
+              <w:t>test_data_files.py</w:t>
+            </w:r>
+          </w:p>
+          <w:p>
+            <w:r>
+              <w:t xml:space="preserve">user_inventory.csv should have </w:t>
+            </w:r>
+            <w:proofErr w:type="spellStart"/>
+            <w:r>
+              <w:t>stock_id</w:t>
+            </w:r>
+            <w:proofErr w:type="spellEnd"/>
+          </w:p>
+          <w:p>
+            <w:r>
+              <w:t xml:space="preserve">user_inventory.csv should have </w:t>
+            </w:r>
+            <w:proofErr w:type="spellStart"/>
+            <w:r>
+              <w:t>food_item</w:t>
+            </w:r>
+            <w:proofErr w:type="spellEnd"/>
+          </w:p>
+          <w:p>
+            <w:r>
+              <w:lastRenderedPageBreak/>
+              <w:t>user_inventory.csv should have quantity/current amount fields</w:t>
+            </w:r>
+          </w:p>
+          <w:p/>
+          <w:p>
+            <w:r>
+              <w:t xml:space="preserve">user_intake_history.csv should have </w:t>
+            </w:r>
+            <w:proofErr w:type="spellStart"/>
+            <w:r>
+              <w:t>intake_id</w:t>
+            </w:r>
+            <w:proofErr w:type="spellEnd"/>
+          </w:p>
+          <w:p>
+            <w:r>
+              <w:t>user_intake_history.csv should have date</w:t>
+            </w:r>
+          </w:p>
+          <w:p>
+            <w:r>
+              <w:t xml:space="preserve">user_intake_history.csv should have </w:t>
+            </w:r>
+            <w:proofErr w:type="spellStart"/>
+            <w:r>
+              <w:t>meal_type</w:t>
+            </w:r>
+            <w:proofErr w:type="spellEnd"/>
+          </w:p>
+          <w:p/>
+          <w:p>
+            <w:r>
+              <w:t xml:space="preserve">user_intake_items.csv should have </w:t>
+            </w:r>
+            <w:proofErr w:type="spellStart"/>
+            <w:r>
+              <w:t>intake_id</w:t>
+            </w:r>
+            <w:proofErr w:type="spellEnd"/>
+          </w:p>
+          <w:p>
+            <w:r>
+              <w:t xml:space="preserve">user_intake_items.csv should have </w:t>
+            </w:r>
+            <w:proofErr w:type="spellStart"/>
+            <w:r>
+              <w:t>food_item</w:t>
+            </w:r>
+            <w:proofErr w:type="spellEnd"/>
+          </w:p>
+          <w:p>
+            <w:r>
+              <w:drawing>
+                <wp:inline distT="0" distB="0" distL="0" distR="0" wp14:anchorId="1783D85E" wp14:editId="381053AF">
+                  <wp:extent cx="7064375" cy="790575"/>
+                  <wp:effectExtent l="0" t="0" r="3175" b="9525"/>
+                  <wp:docPr id="1560638452" name="Picture 1"/>
+                  <wp:cNvGraphicFramePr>
+                    <a:graphicFrameLocks xmlns:a="http://schemas.openxmlformats.org/drawingml/2006/main" noChangeAspect="1"/>
+                  </wp:cNvGraphicFramePr>
+                  <a:graphic xmlns:a="http://schemas.openxmlformats.org/drawingml/2006/main">
+                    <a:graphicData uri="http://schemas.openxmlformats.org/drawingml/2006/picture">
+                      <pic:pic xmlns:pic="http://schemas.openxmlformats.org/drawingml/2006/picture">
+                        <pic:nvPicPr>
+                          <pic:cNvPr id="1560638452" name=""/>
+                          <pic:cNvPicPr/>
+                        </pic:nvPicPr>
+                        <pic:blipFill>
+                          <a:blip r:embed="rId8"/>
+                          <a:stretch>
+                            <a:fillRect/>
+                          </a:stretch>
+                        </pic:blipFill>
+                        <pic:spPr>
+                          <a:xfrm>
+                            <a:off x="0" y="0"/>
+                            <a:ext cx="7064375" cy="790575"/>
+                          </a:xfrm>
+                          <a:prstGeom prst="rect">
+                            <a:avLst/>
+                          </a:prstGeom>
+                        </pic:spPr>
+                      </pic:pic>
+                    </a:graphicData>
+                  </a:graphic>
+                </wp:inline>
+              </w:drawing>
+            </w:r>
+          </w:p>
+          <w:p>
+            <w:r>
+              <w:t>Project structure exists</w:t>
+            </w:r>
+          </w:p>
+          <w:p>
+            <w:r>
+              <w:t>Resource data folder exists</w:t>
+            </w:r>
+          </w:p>
+          <w:p>
+            <w:r>
+              <w:t>Log folder exists</w:t>
+            </w:r>
+          </w:p>
+          <w:p>
+            <w:r>
+              <w:t>CSV files exist</w:t>
+            </w:r>
+          </w:p>
+          <w:p>
+            <w:r>
+              <w:t>CSV files have headers</w:t>
+            </w:r>
+          </w:p>
+          <w:p>
+            <w:r>
+              <w:t>CSV files have essential required columns</w:t>
+            </w:r>
+          </w:p>
+          <w:p>
+            <w:r>
+              <w:t>Data descriptions file is not empty</w:t>
+            </w:r>
+          </w:p>
+          <w:p/>
+          <w:p>
+            <w:r>
+              <w:t>Evidence: Testing-resources branch, commit 1</w:t>
+            </w:r>
+          </w:p>
+          <w:p/>
+          <w:p/>
+          <w:p>
+            <w:pPr>
+              <w:rPr>
+                <w:b/>
+                <w:bCs/>
+              </w:rPr>
+            </w:pPr>
+            <w:r>
+              <w:rPr>
+                <w:b/>
+                <w:bCs/>
+              </w:rPr>
+              <w:t>test_grocery_service.py</w:t>
+            </w:r>
+          </w:p>
+          <w:p/>
+          <w:tbl>
+            <w:tblPr>
+              <w:tblW w:w="0" w:type="auto"/>
+              <w:tblCellSpacing w:w="15" w:type="dxa"/>
+              <w:tblCellMar>
+                <w:top w:w="15" w:type="dxa"/>
+                <w:left w:w="15" w:type="dxa"/>
+                <w:bottom w:w="15" w:type="dxa"/>
+                <w:right w:w="15" w:type="dxa"/>
+              </w:tblCellMar>
+              <w:tblLook w:val="04A0" w:firstRow="1" w:lastRow="0" w:firstColumn="1" w:lastColumn="0" w:noHBand="0" w:noVBand="1"/>
+            </w:tblPr>
+            <w:tblGrid>
+              <w:gridCol w:w="4996"/>
+              <w:gridCol w:w="4175"/>
+            </w:tblGrid>
+            <w:tr>
+              <w:trPr>
+                <w:tblHeader/>
+                <w:tblCellSpacing w:w="15" w:type="dxa"/>
+              </w:trPr>
+              <w:tc>
+                <w:tcPr>
+                  <w:tcW w:w="4951" w:type="dxa"/>
+                  <w:vAlign w:val="center"/>
+                  <w:hideMark/>
+                </w:tcPr>
+                <w:p>
+                  <w:pPr>
+                    <w:spacing w:after="0" w:line="240" w:lineRule="auto"/>
+                    <w:jc w:val="center"/>
+                    <w:rPr>
+                      <w:rFonts w:ascii="Times New Roman" w:eastAsia="Times New Roman" w:hAnsi="Times New Roman" w:cs="Times New Roman"/>
+                      <w:b/>
+                      <w:bCs/>
+                      <w:sz w:val="24"/>
+                      <w:szCs w:val="24"/>
+                      <w:lang w:val="en-AU" w:eastAsia="en-AU"/>
+                    </w:rPr>
+                  </w:pPr>
+                  <w:r>
+                    <w:rPr>
+                      <w:rFonts w:ascii="Times New Roman" w:eastAsia="Times New Roman" w:hAnsi="Times New Roman" w:cs="Times New Roman"/>
+                      <w:b/>
+                      <w:bCs/>
+                      <w:sz w:val="24"/>
+                      <w:szCs w:val="24"/>
+                      <w:lang w:val="en-AU" w:eastAsia="en-AU"/>
+                    </w:rPr>
+                    <w:t>Function</w:t>
+                  </w:r>
+                </w:p>
+              </w:tc>
+              <w:tc>
+                <w:tcPr>
+                  <w:tcW w:w="4130" w:type="dxa"/>
+                  <w:vAlign w:val="center"/>
+                  <w:hideMark/>
+                </w:tcPr>
+                <w:p>
+                  <w:pPr>
+                    <w:spacing w:after="0" w:line="240" w:lineRule="auto"/>
+                    <w:jc w:val="center"/>
+                    <w:rPr>
+                      <w:rFonts w:ascii="Times New Roman" w:eastAsia="Times New Roman" w:hAnsi="Times New Roman" w:cs="Times New Roman"/>
+                      <w:b/>
+                      <w:bCs/>
+                      <w:sz w:val="24"/>
+                      <w:szCs w:val="24"/>
+                      <w:lang w:val="en-AU" w:eastAsia="en-AU"/>
+                    </w:rPr>
+                  </w:pPr>
+                  <w:r>
+                    <w:rPr>
+                      <w:rFonts w:ascii="Times New Roman" w:eastAsia="Times New Roman" w:hAnsi="Times New Roman" w:cs="Times New Roman"/>
+                      <w:b/>
+                      <w:bCs/>
+                      <w:sz w:val="24"/>
+                      <w:szCs w:val="24"/>
+                      <w:lang w:val="en-AU" w:eastAsia="en-AU"/>
+                    </w:rPr>
+                    <w:t>What the test proves</w:t>
+                  </w:r>
+                </w:p>
+              </w:tc>
+            </w:tr>
+            <w:tr>
+              <w:trPr>
+                <w:tblCellSpacing w:w="15" w:type="dxa"/>
+              </w:trPr>
+              <w:tc>
+                <w:tcPr>
+                  <w:tcW w:w="4951" w:type="dxa"/>
+                  <w:vAlign w:val="center"/>
+                  <w:hideMark/>
+                </w:tcPr>
+                <w:p>
+                  <w:pPr>
+                    <w:spacing w:after="0" w:line="240" w:lineRule="auto"/>
+                    <w:rPr>
+                      <w:rFonts w:ascii="Times New Roman" w:eastAsia="Times New Roman" w:hAnsi="Times New Roman" w:cs="Times New Roman"/>
+                      <w:sz w:val="24"/>
+                      <w:szCs w:val="24"/>
+                      <w:lang w:val="en-AU" w:eastAsia="en-AU"/>
+                    </w:rPr>
+                  </w:pPr>
+                  <w:proofErr w:type="spellStart"/>
+                  <w:r>
+                    <w:rPr>
+                      <w:rFonts w:ascii="Courier New" w:eastAsia="Times New Roman" w:hAnsi="Courier New" w:cs="Courier New"/>
+                      <w:sz w:val="20"/>
+                      <w:szCs w:val="20"/>
+                      <w:lang w:val="en-AU" w:eastAsia="en-AU"/>
+                    </w:rPr>
+                    <w:t>read_csv_</w:t>
+                  </w:r>
+                  <w:proofErr w:type="gramStart"/>
+                  <w:r>
+                    <w:rPr>
+                      <w:rFonts w:ascii="Courier New" w:eastAsia="Times New Roman" w:hAnsi="Courier New" w:cs="Courier New"/>
+                      <w:sz w:val="20"/>
+                      <w:szCs w:val="20"/>
+                      <w:lang w:val="en-AU" w:eastAsia="en-AU"/>
+                    </w:rPr>
+                    <w:t>file</w:t>
+                  </w:r>
+                  <w:proofErr w:type="spellEnd"/>
+                  <w:r>
+                    <w:rPr>
+                      <w:rFonts w:ascii="Courier New" w:eastAsia="Times New Roman" w:hAnsi="Courier New" w:cs="Courier New"/>
+                      <w:sz w:val="20"/>
+                      <w:szCs w:val="20"/>
+                      <w:lang w:val="en-AU" w:eastAsia="en-AU"/>
+                    </w:rPr>
+                    <w:t>(</w:t>
+                  </w:r>
+                  <w:proofErr w:type="gramEnd"/>
+                  <w:r>
+                    <w:rPr>
+                      <w:rFonts w:ascii="Courier New" w:eastAsia="Times New Roman" w:hAnsi="Courier New" w:cs="Courier New"/>
+                      <w:sz w:val="20"/>
+                      <w:szCs w:val="20"/>
+                      <w:lang w:val="en-AU" w:eastAsia="en-AU"/>
+                    </w:rPr>
+                    <w:t>)</w:t>
+                  </w:r>
+                </w:p>
+              </w:tc>
+              <w:tc>
+                <w:tcPr>
+                  <w:tcW w:w="4130" w:type="dxa"/>
+                  <w:vAlign w:val="center"/>
+                  <w:hideMark/>
+                </w:tcPr>
+                <w:p>
+                  <w:pPr>
+                    <w:spacing w:after="0" w:line="240" w:lineRule="auto"/>
+                    <w:rPr>
+                      <w:rFonts w:ascii="Times New Roman" w:eastAsia="Times New Roman" w:hAnsi="Times New Roman" w:cs="Times New Roman"/>
+                      <w:sz w:val="24"/>
+                      <w:szCs w:val="24"/>
+                      <w:lang w:val="en-AU" w:eastAsia="en-AU"/>
+                    </w:rPr>
+                  </w:pPr>
+                  <w:r>
+                    <w:rPr>
+                      <w:rFonts w:ascii="Times New Roman" w:eastAsia="Times New Roman" w:hAnsi="Times New Roman" w:cs="Times New Roman"/>
+                      <w:sz w:val="24"/>
+                      <w:szCs w:val="24"/>
+                      <w:lang w:val="en-AU" w:eastAsia="en-AU"/>
+                    </w:rPr>
+                    <w:t xml:space="preserve">CSVs become </w:t>
+                  </w:r>
+                  <w:proofErr w:type="spellStart"/>
+                  <w:r>
+                    <w:rPr>
+                      <w:rFonts w:ascii="Times New Roman" w:eastAsia="Times New Roman" w:hAnsi="Times New Roman" w:cs="Times New Roman"/>
+                      <w:sz w:val="24"/>
+                      <w:szCs w:val="24"/>
+                      <w:lang w:val="en-AU" w:eastAsia="en-AU"/>
+                    </w:rPr>
+                    <w:t>DataFrames</w:t>
+                  </w:r>
+                  <w:proofErr w:type="spellEnd"/>
+                </w:p>
+              </w:tc>
+            </w:tr>
+            <w:tr>
+              <w:trPr>
+                <w:tblCellSpacing w:w="15" w:type="dxa"/>
+              </w:trPr>
+              <w:tc>
+                <w:tcPr>
+                  <w:tcW w:w="4951" w:type="dxa"/>
+                  <w:vAlign w:val="center"/>
+                  <w:hideMark/>
+                </w:tcPr>
+                <w:p>
+                  <w:pPr>
+                    <w:spacing w:after="0" w:line="240" w:lineRule="auto"/>
+                    <w:rPr>
+                      <w:rFonts w:ascii="Times New Roman" w:eastAsia="Times New Roman" w:hAnsi="Times New Roman" w:cs="Times New Roman"/>
+                      <w:sz w:val="24"/>
+                      <w:szCs w:val="24"/>
+                      <w:lang w:val="en-AU" w:eastAsia="en-AU"/>
+                    </w:rPr>
+                  </w:pPr>
+                  <w:proofErr w:type="spellStart"/>
+                  <w:r>
+                    <w:rPr>
+                      <w:rFonts w:ascii="Courier New" w:eastAsia="Times New Roman" w:hAnsi="Courier New" w:cs="Courier New"/>
+                      <w:sz w:val="20"/>
+                      <w:szCs w:val="20"/>
+                      <w:lang w:val="en-AU" w:eastAsia="en-AU"/>
+                    </w:rPr>
+                    <w:lastRenderedPageBreak/>
+                    <w:t>read_csv_</w:t>
+                  </w:r>
+                  <w:proofErr w:type="gramStart"/>
+                  <w:r>
+                    <w:rPr>
+                      <w:rFonts w:ascii="Courier New" w:eastAsia="Times New Roman" w:hAnsi="Courier New" w:cs="Courier New"/>
+                      <w:sz w:val="20"/>
+                      <w:szCs w:val="20"/>
+                      <w:lang w:val="en-AU" w:eastAsia="en-AU"/>
+                    </w:rPr>
+                    <w:t>file</w:t>
+                  </w:r>
+                  <w:proofErr w:type="spellEnd"/>
+                  <w:r>
+                    <w:rPr>
+                      <w:rFonts w:ascii="Courier New" w:eastAsia="Times New Roman" w:hAnsi="Courier New" w:cs="Courier New"/>
+                      <w:sz w:val="20"/>
+                      <w:szCs w:val="20"/>
+                      <w:lang w:val="en-AU" w:eastAsia="en-AU"/>
+                    </w:rPr>
+                    <w:t>(</w:t>
+                  </w:r>
+                  <w:proofErr w:type="gramEnd"/>
+                  <w:r>
+                    <w:rPr>
+                      <w:rFonts w:ascii="Courier New" w:eastAsia="Times New Roman" w:hAnsi="Courier New" w:cs="Courier New"/>
+                      <w:sz w:val="20"/>
+                      <w:szCs w:val="20"/>
+                      <w:lang w:val="en-AU" w:eastAsia="en-AU"/>
+                    </w:rPr>
+                    <w:t>)</w:t>
+                  </w:r>
+                  <w:r>
+                    <w:rPr>
+                      <w:rFonts w:ascii="Times New Roman" w:eastAsia="Times New Roman" w:hAnsi="Times New Roman" w:cs="Times New Roman"/>
+                      <w:sz w:val="24"/>
+                      <w:szCs w:val="24"/>
+                      <w:lang w:val="en-AU" w:eastAsia="en-AU"/>
+                    </w:rPr>
+                    <w:t xml:space="preserve"> missing file case</w:t>
+                  </w:r>
+                </w:p>
+              </w:tc>
+              <w:tc>
+                <w:tcPr>
+                  <w:tcW w:w="4130" w:type="dxa"/>
+                  <w:vAlign w:val="center"/>
+                  <w:hideMark/>
+                </w:tcPr>
+                <w:p>
+                  <w:pPr>
+                    <w:spacing w:after="0" w:line="240" w:lineRule="auto"/>
+                    <w:rPr>
+                      <w:rFonts w:ascii="Times New Roman" w:eastAsia="Times New Roman" w:hAnsi="Times New Roman" w:cs="Times New Roman"/>
+                      <w:sz w:val="24"/>
+                      <w:szCs w:val="24"/>
+                      <w:lang w:val="en-AU" w:eastAsia="en-AU"/>
+                    </w:rPr>
+                  </w:pPr>
+                  <w:r>
+                    <w:rPr>
+                      <w:rFonts w:ascii="Times New Roman" w:eastAsia="Times New Roman" w:hAnsi="Times New Roman" w:cs="Times New Roman"/>
+                      <w:sz w:val="24"/>
+                      <w:szCs w:val="24"/>
+                      <w:lang w:val="en-AU" w:eastAsia="en-AU"/>
+                    </w:rPr>
+                    <w:t>Missing files do not crash server logic</w:t>
+                  </w:r>
+                </w:p>
+              </w:tc>
+            </w:tr>
+            <w:tr>
+              <w:trPr>
+                <w:tblCellSpacing w:w="15" w:type="dxa"/>
+              </w:trPr>
+              <w:tc>
+                <w:tcPr>
+                  <w:tcW w:w="4951" w:type="dxa"/>
+                  <w:vAlign w:val="center"/>
+                  <w:hideMark/>
+                </w:tcPr>
+                <w:p>
+                  <w:pPr>
+                    <w:spacing w:after="0" w:line="240" w:lineRule="auto"/>
+                    <w:rPr>
+                      <w:rFonts w:ascii="Times New Roman" w:eastAsia="Times New Roman" w:hAnsi="Times New Roman" w:cs="Times New Roman"/>
+                      <w:sz w:val="24"/>
+                      <w:szCs w:val="24"/>
+                      <w:lang w:val="en-AU" w:eastAsia="en-AU"/>
+                    </w:rPr>
+                  </w:pPr>
+                  <w:proofErr w:type="spellStart"/>
+                  <w:r>
+                    <w:rPr>
+                      <w:rFonts w:ascii="Courier New" w:eastAsia="Times New Roman" w:hAnsi="Courier New" w:cs="Courier New"/>
+                      <w:sz w:val="20"/>
+                      <w:szCs w:val="20"/>
+                      <w:lang w:val="en-AU" w:eastAsia="en-AU"/>
+                    </w:rPr>
+                    <w:t>read_</w:t>
+                  </w:r>
+                  <w:proofErr w:type="gramStart"/>
+                  <w:r>
+                    <w:rPr>
+                      <w:rFonts w:ascii="Courier New" w:eastAsia="Times New Roman" w:hAnsi="Courier New" w:cs="Courier New"/>
+                      <w:sz w:val="20"/>
+                      <w:szCs w:val="20"/>
+                      <w:lang w:val="en-AU" w:eastAsia="en-AU"/>
+                    </w:rPr>
+                    <w:t>inventory</w:t>
+                  </w:r>
+                  <w:proofErr w:type="spellEnd"/>
+                  <w:r>
+                    <w:rPr>
+                      <w:rFonts w:ascii="Courier New" w:eastAsia="Times New Roman" w:hAnsi="Courier New" w:cs="Courier New"/>
+                      <w:sz w:val="20"/>
+                      <w:szCs w:val="20"/>
+                      <w:lang w:val="en-AU" w:eastAsia="en-AU"/>
+                    </w:rPr>
+                    <w:t>(</w:t>
+                  </w:r>
+                  <w:proofErr w:type="gramEnd"/>
+                  <w:r>
+                    <w:rPr>
+                      <w:rFonts w:ascii="Courier New" w:eastAsia="Times New Roman" w:hAnsi="Courier New" w:cs="Courier New"/>
+                      <w:sz w:val="20"/>
+                      <w:szCs w:val="20"/>
+                      <w:lang w:val="en-AU" w:eastAsia="en-AU"/>
+                    </w:rPr>
+                    <w:t>)</w:t>
+                  </w:r>
+                </w:p>
+              </w:tc>
+              <w:tc>
+                <w:tcPr>
+                  <w:tcW w:w="4130" w:type="dxa"/>
+                  <w:vAlign w:val="center"/>
+                  <w:hideMark/>
+                </w:tcPr>
+                <w:p>
+                  <w:pPr>
+                    <w:spacing w:after="0" w:line="240" w:lineRule="auto"/>
+                    <w:rPr>
+                      <w:rFonts w:ascii="Times New Roman" w:eastAsia="Times New Roman" w:hAnsi="Times New Roman" w:cs="Times New Roman"/>
+                      <w:sz w:val="24"/>
+                      <w:szCs w:val="24"/>
+                      <w:lang w:val="en-AU" w:eastAsia="en-AU"/>
+                    </w:rPr>
+                  </w:pPr>
+                  <w:r>
+                    <w:rPr>
+                      <w:rFonts w:ascii="Times New Roman" w:eastAsia="Times New Roman" w:hAnsi="Times New Roman" w:cs="Times New Roman"/>
+                      <w:sz w:val="24"/>
+                      <w:szCs w:val="24"/>
+                      <w:lang w:val="en-AU" w:eastAsia="en-AU"/>
+                    </w:rPr>
+                    <w:t>Inventory data can load</w:t>
+                  </w:r>
+                </w:p>
+              </w:tc>
+            </w:tr>
+            <w:tr>
+              <w:trPr>
+                <w:tblCellSpacing w:w="15" w:type="dxa"/>
+              </w:trPr>
+              <w:tc>
+                <w:tcPr>
+                  <w:tcW w:w="4951" w:type="dxa"/>
+                  <w:vAlign w:val="center"/>
+                  <w:hideMark/>
+                </w:tcPr>
+                <w:p>
+                  <w:pPr>
+                    <w:spacing w:after="0" w:line="240" w:lineRule="auto"/>
+                    <w:rPr>
+                      <w:rFonts w:ascii="Times New Roman" w:eastAsia="Times New Roman" w:hAnsi="Times New Roman" w:cs="Times New Roman"/>
+                      <w:sz w:val="24"/>
+                      <w:szCs w:val="24"/>
+                      <w:lang w:val="en-AU" w:eastAsia="en-AU"/>
+                    </w:rPr>
+                  </w:pPr>
+                  <w:proofErr w:type="spellStart"/>
+                  <w:r>
+                    <w:rPr>
+                      <w:rFonts w:ascii="Courier New" w:eastAsia="Times New Roman" w:hAnsi="Courier New" w:cs="Courier New"/>
+                      <w:sz w:val="20"/>
+                      <w:szCs w:val="20"/>
+                      <w:lang w:val="en-AU" w:eastAsia="en-AU"/>
+                    </w:rPr>
+                    <w:t>read_intake_</w:t>
+                  </w:r>
+                  <w:proofErr w:type="gramStart"/>
+                  <w:r>
+                    <w:rPr>
+                      <w:rFonts w:ascii="Courier New" w:eastAsia="Times New Roman" w:hAnsi="Courier New" w:cs="Courier New"/>
+                      <w:sz w:val="20"/>
+                      <w:szCs w:val="20"/>
+                      <w:lang w:val="en-AU" w:eastAsia="en-AU"/>
+                    </w:rPr>
+                    <w:t>history</w:t>
+                  </w:r>
+                  <w:proofErr w:type="spellEnd"/>
+                  <w:r>
+                    <w:rPr>
+                      <w:rFonts w:ascii="Courier New" w:eastAsia="Times New Roman" w:hAnsi="Courier New" w:cs="Courier New"/>
+                      <w:sz w:val="20"/>
+                      <w:szCs w:val="20"/>
+                      <w:lang w:val="en-AU" w:eastAsia="en-AU"/>
+                    </w:rPr>
+                    <w:t>(</w:t>
+                  </w:r>
+                  <w:proofErr w:type="gramEnd"/>
+                  <w:r>
+                    <w:rPr>
+                      <w:rFonts w:ascii="Courier New" w:eastAsia="Times New Roman" w:hAnsi="Courier New" w:cs="Courier New"/>
+                      <w:sz w:val="20"/>
+                      <w:szCs w:val="20"/>
+                      <w:lang w:val="en-AU" w:eastAsia="en-AU"/>
+                    </w:rPr>
+                    <w:t>)</w:t>
+                  </w:r>
+                </w:p>
+              </w:tc>
+              <w:tc>
+                <w:tcPr>
+                  <w:tcW w:w="4130" w:type="dxa"/>
+                  <w:vAlign w:val="center"/>
+                  <w:hideMark/>
+                </w:tcPr>
+                <w:p>
+                  <w:pPr>
+                    <w:spacing w:after="0" w:line="240" w:lineRule="auto"/>
+                    <w:rPr>
+                      <w:rFonts w:ascii="Times New Roman" w:eastAsia="Times New Roman" w:hAnsi="Times New Roman" w:cs="Times New Roman"/>
+                      <w:sz w:val="24"/>
+                      <w:szCs w:val="24"/>
+                      <w:lang w:val="en-AU" w:eastAsia="en-AU"/>
+                    </w:rPr>
+                  </w:pPr>
+                  <w:r>
+                    <w:rPr>
+                      <w:rFonts w:ascii="Times New Roman" w:eastAsia="Times New Roman" w:hAnsi="Times New Roman" w:cs="Times New Roman"/>
+                      <w:sz w:val="24"/>
+                      <w:szCs w:val="24"/>
+                      <w:lang w:val="en-AU" w:eastAsia="en-AU"/>
+                    </w:rPr>
+                    <w:t>Intake history data can load</w:t>
+                  </w:r>
+                </w:p>
+              </w:tc>
+            </w:tr>
+            <w:tr>
+              <w:trPr>
+                <w:tblCellSpacing w:w="15" w:type="dxa"/>
+              </w:trPr>
+              <w:tc>
+                <w:tcPr>
+                  <w:tcW w:w="4951" w:type="dxa"/>
+                  <w:vAlign w:val="center"/>
+                  <w:hideMark/>
+                </w:tcPr>
+                <w:p>
+                  <w:pPr>
+                    <w:spacing w:after="0" w:line="240" w:lineRule="auto"/>
+                    <w:rPr>
+                      <w:rFonts w:ascii="Times New Roman" w:eastAsia="Times New Roman" w:hAnsi="Times New Roman" w:cs="Times New Roman"/>
+                      <w:sz w:val="24"/>
+                      <w:szCs w:val="24"/>
+                      <w:lang w:val="en-AU" w:eastAsia="en-AU"/>
+                    </w:rPr>
+                  </w:pPr>
+                  <w:proofErr w:type="spellStart"/>
+                  <w:r>
+                    <w:rPr>
+                      <w:rFonts w:ascii="Courier New" w:eastAsia="Times New Roman" w:hAnsi="Courier New" w:cs="Courier New"/>
+                      <w:sz w:val="20"/>
+                      <w:szCs w:val="20"/>
+                      <w:lang w:val="en-AU" w:eastAsia="en-AU"/>
+                    </w:rPr>
+                    <w:t>read_intake_</w:t>
+                  </w:r>
+                  <w:proofErr w:type="gramStart"/>
+                  <w:r>
+                    <w:rPr>
+                      <w:rFonts w:ascii="Courier New" w:eastAsia="Times New Roman" w:hAnsi="Courier New" w:cs="Courier New"/>
+                      <w:sz w:val="20"/>
+                      <w:szCs w:val="20"/>
+                      <w:lang w:val="en-AU" w:eastAsia="en-AU"/>
+                    </w:rPr>
+                    <w:t>items</w:t>
+                  </w:r>
+                  <w:proofErr w:type="spellEnd"/>
+                  <w:r>
+                    <w:rPr>
+                      <w:rFonts w:ascii="Courier New" w:eastAsia="Times New Roman" w:hAnsi="Courier New" w:cs="Courier New"/>
+                      <w:sz w:val="20"/>
+                      <w:szCs w:val="20"/>
+                      <w:lang w:val="en-AU" w:eastAsia="en-AU"/>
+                    </w:rPr>
+                    <w:t>(</w:t>
+                  </w:r>
+                  <w:proofErr w:type="gramEnd"/>
+                  <w:r>
+                    <w:rPr>
+                      <w:rFonts w:ascii="Courier New" w:eastAsia="Times New Roman" w:hAnsi="Courier New" w:cs="Courier New"/>
+                      <w:sz w:val="20"/>
+                      <w:szCs w:val="20"/>
+                      <w:lang w:val="en-AU" w:eastAsia="en-AU"/>
+                    </w:rPr>
+                    <w:t>)</w:t>
+                  </w:r>
+                </w:p>
+              </w:tc>
+              <w:tc>
+                <w:tcPr>
+                  <w:tcW w:w="4130" w:type="dxa"/>
+                  <w:vAlign w:val="center"/>
+                  <w:hideMark/>
+                </w:tcPr>
+                <w:p>
+                  <w:pPr>
+                    <w:spacing w:after="0" w:line="240" w:lineRule="auto"/>
+                    <w:rPr>
+                      <w:rFonts w:ascii="Times New Roman" w:eastAsia="Times New Roman" w:hAnsi="Times New Roman" w:cs="Times New Roman"/>
+                      <w:sz w:val="24"/>
+                      <w:szCs w:val="24"/>
+                      <w:lang w:val="en-AU" w:eastAsia="en-AU"/>
+                    </w:rPr>
+                  </w:pPr>
+                  <w:r>
+                    <w:rPr>
+                      <w:rFonts w:ascii="Times New Roman" w:eastAsia="Times New Roman" w:hAnsi="Times New Roman" w:cs="Times New Roman"/>
+                      <w:sz w:val="24"/>
+                      <w:szCs w:val="24"/>
+                      <w:lang w:val="en-AU" w:eastAsia="en-AU"/>
+                    </w:rPr>
+                    <w:t>Intake item data can load</w:t>
+                  </w:r>
+                </w:p>
+              </w:tc>
+            </w:tr>
+            <w:tr>
+              <w:trPr>
+                <w:tblCellSpacing w:w="15" w:type="dxa"/>
+              </w:trPr>
+              <w:tc>
+                <w:tcPr>
+                  <w:tcW w:w="4951" w:type="dxa"/>
+                  <w:vAlign w:val="center"/>
+                  <w:hideMark/>
+                </w:tcPr>
+                <w:p>
+                  <w:pPr>
+                    <w:spacing w:after="0" w:line="240" w:lineRule="auto"/>
+                    <w:rPr>
+                      <w:rFonts w:ascii="Times New Roman" w:eastAsia="Times New Roman" w:hAnsi="Times New Roman" w:cs="Times New Roman"/>
+                      <w:sz w:val="24"/>
+                      <w:szCs w:val="24"/>
+                      <w:lang w:val="en-AU" w:eastAsia="en-AU"/>
+                    </w:rPr>
+                  </w:pPr>
+                  <w:proofErr w:type="spellStart"/>
+                  <w:r>
+                    <w:rPr>
+                      <w:rFonts w:ascii="Courier New" w:eastAsia="Times New Roman" w:hAnsi="Courier New" w:cs="Courier New"/>
+                      <w:sz w:val="20"/>
+                      <w:szCs w:val="20"/>
+                      <w:lang w:val="en-AU" w:eastAsia="en-AU"/>
+                    </w:rPr>
+                    <w:t>df_to_</w:t>
+                  </w:r>
+                  <w:proofErr w:type="gramStart"/>
+                  <w:r>
+                    <w:rPr>
+                      <w:rFonts w:ascii="Courier New" w:eastAsia="Times New Roman" w:hAnsi="Courier New" w:cs="Courier New"/>
+                      <w:sz w:val="20"/>
+                      <w:szCs w:val="20"/>
+                      <w:lang w:val="en-AU" w:eastAsia="en-AU"/>
+                    </w:rPr>
+                    <w:t>records</w:t>
+                  </w:r>
+                  <w:proofErr w:type="spellEnd"/>
+                  <w:r>
+                    <w:rPr>
+                      <w:rFonts w:ascii="Courier New" w:eastAsia="Times New Roman" w:hAnsi="Courier New" w:cs="Courier New"/>
+                      <w:sz w:val="20"/>
+                      <w:szCs w:val="20"/>
+                      <w:lang w:val="en-AU" w:eastAsia="en-AU"/>
+                    </w:rPr>
+                    <w:t>(</w:t>
+                  </w:r>
+                  <w:proofErr w:type="gramEnd"/>
+                  <w:r>
+                    <w:rPr>
+                      <w:rFonts w:ascii="Courier New" w:eastAsia="Times New Roman" w:hAnsi="Courier New" w:cs="Courier New"/>
+                      <w:sz w:val="20"/>
+                      <w:szCs w:val="20"/>
+                      <w:lang w:val="en-AU" w:eastAsia="en-AU"/>
+                    </w:rPr>
+                    <w:t>)</w:t>
+                  </w:r>
+                </w:p>
+              </w:tc>
+              <w:tc>
+                <w:tcPr>
+                  <w:tcW w:w="4130" w:type="dxa"/>
+                  <w:vAlign w:val="center"/>
+                  <w:hideMark/>
+                </w:tcPr>
+                <w:p>
+                  <w:pPr>
+                    <w:spacing w:after="0" w:line="240" w:lineRule="auto"/>
+                    <w:rPr>
+                      <w:rFonts w:ascii="Times New Roman" w:eastAsia="Times New Roman" w:hAnsi="Times New Roman" w:cs="Times New Roman"/>
+                      <w:sz w:val="24"/>
+                      <w:szCs w:val="24"/>
+                      <w:lang w:val="en-AU" w:eastAsia="en-AU"/>
+                    </w:rPr>
+                  </w:pPr>
+                  <w:proofErr w:type="spellStart"/>
+                  <w:r>
+                    <w:rPr>
+                      <w:rFonts w:ascii="Times New Roman" w:eastAsia="Times New Roman" w:hAnsi="Times New Roman" w:cs="Times New Roman"/>
+                      <w:sz w:val="24"/>
+                      <w:szCs w:val="24"/>
+                      <w:lang w:val="en-AU" w:eastAsia="en-AU"/>
+                    </w:rPr>
+                    <w:t>DataFrames</w:t>
+                  </w:r>
+                  <w:proofErr w:type="spellEnd"/>
+                  <w:r>
+                    <w:rPr>
+                      <w:rFonts w:ascii="Times New Roman" w:eastAsia="Times New Roman" w:hAnsi="Times New Roman" w:cs="Times New Roman"/>
+                      <w:sz w:val="24"/>
+                      <w:szCs w:val="24"/>
+                      <w:lang w:val="en-AU" w:eastAsia="en-AU"/>
+                    </w:rPr>
+                    <w:t xml:space="preserve"> become MCP-friendly lists</w:t>
+                  </w:r>
+                </w:p>
+              </w:tc>
+            </w:tr>
+            <w:tr>
+              <w:trPr>
+                <w:tblCellSpacing w:w="15" w:type="dxa"/>
+              </w:trPr>
+              <w:tc>
+                <w:tcPr>
+                  <w:tcW w:w="4951" w:type="dxa"/>
+                  <w:vAlign w:val="center"/>
+                  <w:hideMark/>
+                </w:tcPr>
+                <w:p>
+                  <w:pPr>
+                    <w:spacing w:after="0" w:line="240" w:lineRule="auto"/>
+                    <w:rPr>
+                      <w:rFonts w:ascii="Times New Roman" w:eastAsia="Times New Roman" w:hAnsi="Times New Roman" w:cs="Times New Roman"/>
+                      <w:sz w:val="24"/>
+                      <w:szCs w:val="24"/>
+                      <w:lang w:val="en-AU" w:eastAsia="en-AU"/>
+                    </w:rPr>
+                  </w:pPr>
+                  <w:proofErr w:type="spellStart"/>
+                  <w:r>
+                    <w:rPr>
+                      <w:rFonts w:ascii="Courier New" w:eastAsia="Times New Roman" w:hAnsi="Courier New" w:cs="Courier New"/>
+                      <w:sz w:val="20"/>
+                      <w:szCs w:val="20"/>
+                      <w:lang w:val="en-AU" w:eastAsia="en-AU"/>
+                    </w:rPr>
+                    <w:t>to_</w:t>
+                  </w:r>
+                  <w:proofErr w:type="gramStart"/>
+                  <w:r>
+                    <w:rPr>
+                      <w:rFonts w:ascii="Courier New" w:eastAsia="Times New Roman" w:hAnsi="Courier New" w:cs="Courier New"/>
+                      <w:sz w:val="20"/>
+                      <w:szCs w:val="20"/>
+                      <w:lang w:val="en-AU" w:eastAsia="en-AU"/>
+                    </w:rPr>
+                    <w:t>json</w:t>
+                  </w:r>
+                  <w:proofErr w:type="spellEnd"/>
+                  <w:r>
+                    <w:rPr>
+                      <w:rFonts w:ascii="Courier New" w:eastAsia="Times New Roman" w:hAnsi="Courier New" w:cs="Courier New"/>
+                      <w:sz w:val="20"/>
+                      <w:szCs w:val="20"/>
+                      <w:lang w:val="en-AU" w:eastAsia="en-AU"/>
+                    </w:rPr>
+                    <w:t>(</w:t>
+                  </w:r>
+                  <w:proofErr w:type="gramEnd"/>
+                  <w:r>
+                    <w:rPr>
+                      <w:rFonts w:ascii="Courier New" w:eastAsia="Times New Roman" w:hAnsi="Courier New" w:cs="Courier New"/>
+                      <w:sz w:val="20"/>
+                      <w:szCs w:val="20"/>
+                      <w:lang w:val="en-AU" w:eastAsia="en-AU"/>
+                    </w:rPr>
+                    <w:t>)</w:t>
+                  </w:r>
+                </w:p>
+              </w:tc>
+              <w:tc>
+                <w:tcPr>
+                  <w:tcW w:w="4130" w:type="dxa"/>
+                  <w:vAlign w:val="center"/>
+                  <w:hideMark/>
+                </w:tcPr>
+                <w:p>
+                  <w:pPr>
+                    <w:spacing w:after="0" w:line="240" w:lineRule="auto"/>
+                    <w:rPr>
+                      <w:rFonts w:ascii="Times New Roman" w:eastAsia="Times New Roman" w:hAnsi="Times New Roman" w:cs="Times New Roman"/>
+                      <w:sz w:val="24"/>
+                      <w:szCs w:val="24"/>
+                      <w:lang w:val="en-AU" w:eastAsia="en-AU"/>
+                    </w:rPr>
+                  </w:pPr>
+                  <w:r>
+                    <w:rPr>
+                      <w:rFonts w:ascii="Times New Roman" w:eastAsia="Times New Roman" w:hAnsi="Times New Roman" w:cs="Times New Roman"/>
+                      <w:sz w:val="24"/>
+                      <w:szCs w:val="24"/>
+                      <w:lang w:val="en-AU" w:eastAsia="en-AU"/>
+                    </w:rPr>
+                    <w:t>Python objects become valid JSON strings</w:t>
+                  </w:r>
+                </w:p>
+              </w:tc>
+            </w:tr>
+            <w:tr>
+              <w:trPr>
+                <w:tblCellSpacing w:w="15" w:type="dxa"/>
+              </w:trPr>
+              <w:tc>
+                <w:tcPr>
+                  <w:tcW w:w="4951" w:type="dxa"/>
+                  <w:vAlign w:val="center"/>
+                  <w:hideMark/>
+                </w:tcPr>
+                <w:p>
+                  <w:pPr>
+                    <w:spacing w:after="0" w:line="240" w:lineRule="auto"/>
+                    <w:rPr>
+                      <w:rFonts w:ascii="Times New Roman" w:eastAsia="Times New Roman" w:hAnsi="Times New Roman" w:cs="Times New Roman"/>
+                      <w:sz w:val="24"/>
+                      <w:szCs w:val="24"/>
+                      <w:lang w:val="en-AU" w:eastAsia="en-AU"/>
+                    </w:rPr>
+                  </w:pPr>
+                  <w:proofErr w:type="spellStart"/>
+                  <w:r>
+                    <w:rPr>
+                      <w:rFonts w:ascii="Courier New" w:eastAsia="Times New Roman" w:hAnsi="Courier New" w:cs="Courier New"/>
+                      <w:sz w:val="20"/>
+                      <w:szCs w:val="20"/>
+                      <w:lang w:val="en-AU" w:eastAsia="en-AU"/>
+                    </w:rPr>
+                    <w:t>list_inventory_</w:t>
+                  </w:r>
+                  <w:proofErr w:type="gramStart"/>
+                  <w:r>
+                    <w:rPr>
+                      <w:rFonts w:ascii="Courier New" w:eastAsia="Times New Roman" w:hAnsi="Courier New" w:cs="Courier New"/>
+                      <w:sz w:val="20"/>
+                      <w:szCs w:val="20"/>
+                      <w:lang w:val="en-AU" w:eastAsia="en-AU"/>
+                    </w:rPr>
+                    <w:t>items</w:t>
+                  </w:r>
+                  <w:proofErr w:type="spellEnd"/>
+                  <w:r>
+                    <w:rPr>
+                      <w:rFonts w:ascii="Courier New" w:eastAsia="Times New Roman" w:hAnsi="Courier New" w:cs="Courier New"/>
+                      <w:sz w:val="20"/>
+                      <w:szCs w:val="20"/>
+                      <w:lang w:val="en-AU" w:eastAsia="en-AU"/>
+                    </w:rPr>
+                    <w:t>(</w:t>
+                  </w:r>
+                  <w:proofErr w:type="gramEnd"/>
+                  <w:r>
+                    <w:rPr>
+                      <w:rFonts w:ascii="Courier New" w:eastAsia="Times New Roman" w:hAnsi="Courier New" w:cs="Courier New"/>
+                      <w:sz w:val="20"/>
+                      <w:szCs w:val="20"/>
+                      <w:lang w:val="en-AU" w:eastAsia="en-AU"/>
+                    </w:rPr>
+                    <w:t>)</w:t>
+                  </w:r>
+                </w:p>
+              </w:tc>
+              <w:tc>
+                <w:tcPr>
+                  <w:tcW w:w="4130" w:type="dxa"/>
+                  <w:vAlign w:val="center"/>
+                  <w:hideMark/>
+                </w:tcPr>
+                <w:p>
+                  <w:pPr>
+                    <w:spacing w:after="0" w:line="240" w:lineRule="auto"/>
+                    <w:rPr>
+                      <w:rFonts w:ascii="Times New Roman" w:eastAsia="Times New Roman" w:hAnsi="Times New Roman" w:cs="Times New Roman"/>
+                      <w:sz w:val="24"/>
+                      <w:szCs w:val="24"/>
+                      <w:lang w:val="en-AU" w:eastAsia="en-AU"/>
+                    </w:rPr>
+                  </w:pPr>
+                  <w:r>
+                    <w:rPr>
+                      <w:rFonts w:ascii="Times New Roman" w:eastAsia="Times New Roman" w:hAnsi="Times New Roman" w:cs="Times New Roman"/>
+                      <w:sz w:val="24"/>
+                      <w:szCs w:val="24"/>
+                      <w:lang w:val="en-AU" w:eastAsia="en-AU"/>
+                    </w:rPr>
+                    <w:t>Inventory can be returned</w:t>
+                  </w:r>
+                </w:p>
+              </w:tc>
+            </w:tr>
+            <w:tr>
+              <w:trPr>
+                <w:tblCellSpacing w:w="15" w:type="dxa"/>
+              </w:trPr>
+              <w:tc>
+                <w:tcPr>
+                  <w:tcW w:w="4951" w:type="dxa"/>
+                  <w:vAlign w:val="center"/>
+                  <w:hideMark/>
+                </w:tcPr>
+                <w:p>
+                  <w:pPr>
+                    <w:spacing w:after="0" w:line="240" w:lineRule="auto"/>
+                    <w:rPr>
+                      <w:rFonts w:ascii="Times New Roman" w:eastAsia="Times New Roman" w:hAnsi="Times New Roman" w:cs="Times New Roman"/>
+                      <w:sz w:val="24"/>
+                      <w:szCs w:val="24"/>
+                      <w:lang w:val="en-AU" w:eastAsia="en-AU"/>
+                    </w:rPr>
+                  </w:pPr>
+                  <w:proofErr w:type="spellStart"/>
+                  <w:r>
+                    <w:rPr>
+                      <w:rFonts w:ascii="Courier New" w:eastAsia="Times New Roman" w:hAnsi="Courier New" w:cs="Courier New"/>
+                      <w:sz w:val="20"/>
+                      <w:szCs w:val="20"/>
+                      <w:lang w:val="en-AU" w:eastAsia="en-AU"/>
+                    </w:rPr>
+                    <w:t>list_inventory_</w:t>
+                  </w:r>
+                  <w:proofErr w:type="gramStart"/>
+                  <w:r>
+                    <w:rPr>
+                      <w:rFonts w:ascii="Courier New" w:eastAsia="Times New Roman" w:hAnsi="Courier New" w:cs="Courier New"/>
+                      <w:sz w:val="20"/>
+                      <w:szCs w:val="20"/>
+                      <w:lang w:val="en-AU" w:eastAsia="en-AU"/>
+                    </w:rPr>
+                    <w:t>items</w:t>
+                  </w:r>
+                  <w:proofErr w:type="spellEnd"/>
+                  <w:r>
+                    <w:rPr>
+                      <w:rFonts w:ascii="Courier New" w:eastAsia="Times New Roman" w:hAnsi="Courier New" w:cs="Courier New"/>
+                      <w:sz w:val="20"/>
+                      <w:szCs w:val="20"/>
+                      <w:lang w:val="en-AU" w:eastAsia="en-AU"/>
+                    </w:rPr>
+                    <w:t>(</w:t>
+                  </w:r>
+                  <w:proofErr w:type="gramEnd"/>
+                  <w:r>
+                    <w:rPr>
+                      <w:rFonts w:ascii="Courier New" w:eastAsia="Times New Roman" w:hAnsi="Courier New" w:cs="Courier New"/>
+                      <w:sz w:val="20"/>
+                      <w:szCs w:val="20"/>
+                      <w:lang w:val="en-AU" w:eastAsia="en-AU"/>
+                    </w:rPr>
+                    <w:t>category=...)</w:t>
+                  </w:r>
+                </w:p>
+              </w:tc>
+              <w:tc>
+                <w:tcPr>
+                  <w:tcW w:w="4130" w:type="dxa"/>
+                  <w:vAlign w:val="center"/>
+                  <w:hideMark/>
+                </w:tcPr>
+                <w:p>
+                  <w:pPr>
+                    <w:spacing w:after="0" w:line="240" w:lineRule="auto"/>
+                    <w:rPr>
+                      <w:rFonts w:ascii="Times New Roman" w:eastAsia="Times New Roman" w:hAnsi="Times New Roman" w:cs="Times New Roman"/>
+                      <w:sz w:val="24"/>
+                      <w:szCs w:val="24"/>
+                      <w:lang w:val="en-AU" w:eastAsia="en-AU"/>
+                    </w:rPr>
+                  </w:pPr>
+                  <w:r>
+                    <w:rPr>
+                      <w:rFonts w:ascii="Times New Roman" w:eastAsia="Times New Roman" w:hAnsi="Times New Roman" w:cs="Times New Roman"/>
+                      <w:sz w:val="24"/>
+                      <w:szCs w:val="24"/>
+                      <w:lang w:val="en-AU" w:eastAsia="en-AU"/>
+                    </w:rPr>
+                    <w:t>Category filtering works</w:t>
+                  </w:r>
+                </w:p>
+              </w:tc>
+            </w:tr>
+            <w:tr>
+              <w:trPr>
+                <w:tblCellSpacing w:w="15" w:type="dxa"/>
+              </w:trPr>
+              <w:tc>
+                <w:tcPr>
+                  <w:tcW w:w="4951" w:type="dxa"/>
+                  <w:vAlign w:val="center"/>
+                  <w:hideMark/>
+                </w:tcPr>
+                <w:p>
+                  <w:pPr>
+                    <w:spacing w:after="0" w:line="240" w:lineRule="auto"/>
+                    <w:rPr>
+                      <w:rFonts w:ascii="Times New Roman" w:eastAsia="Times New Roman" w:hAnsi="Times New Roman" w:cs="Times New Roman"/>
+                      <w:sz w:val="24"/>
+                      <w:szCs w:val="24"/>
+                      <w:lang w:val="en-AU" w:eastAsia="en-AU"/>
+                    </w:rPr>
+                  </w:pPr>
+                  <w:proofErr w:type="spellStart"/>
+                  <w:r>
+                    <w:rPr>
+                      <w:rFonts w:ascii="Courier New" w:eastAsia="Times New Roman" w:hAnsi="Courier New" w:cs="Courier New"/>
+                      <w:sz w:val="20"/>
+                      <w:szCs w:val="20"/>
+                      <w:lang w:val="en-AU" w:eastAsia="en-AU"/>
+                    </w:rPr>
+                    <w:t>list_inventory_items</w:t>
+                  </w:r>
+                  <w:proofErr w:type="spellEnd"/>
+                  <w:r>
+                    <w:rPr>
+                      <w:rFonts w:ascii="Courier New" w:eastAsia="Times New Roman" w:hAnsi="Courier New" w:cs="Courier New"/>
+                      <w:sz w:val="20"/>
+                      <w:szCs w:val="20"/>
+                      <w:lang w:val="en-AU" w:eastAsia="en-AU"/>
+                    </w:rPr>
+                    <w:t>(</w:t>
+                  </w:r>
+                  <w:proofErr w:type="spellStart"/>
+                  <w:r>
+                    <w:rPr>
+                      <w:rFonts w:ascii="Courier New" w:eastAsia="Times New Roman" w:hAnsi="Courier New" w:cs="Courier New"/>
+                      <w:sz w:val="20"/>
+                      <w:szCs w:val="20"/>
+                      <w:lang w:val="en-AU" w:eastAsia="en-AU"/>
+                    </w:rPr>
+                    <w:t>low_stock_only</w:t>
+                  </w:r>
+                  <w:proofErr w:type="spellEnd"/>
+                  <w:r>
+                    <w:rPr>
+                      <w:rFonts w:ascii="Courier New" w:eastAsia="Times New Roman" w:hAnsi="Courier New" w:cs="Courier New"/>
+                      <w:sz w:val="20"/>
+                      <w:szCs w:val="20"/>
+                      <w:lang w:val="en-AU" w:eastAsia="en-AU"/>
+                    </w:rPr>
+                    <w:t>=True)</w:t>
+                  </w:r>
+                </w:p>
+              </w:tc>
+              <w:tc>
+                <w:tcPr>
+                  <w:tcW w:w="4130" w:type="dxa"/>
+                  <w:vAlign w:val="center"/>
+                  <w:hideMark/>
+                </w:tcPr>
+                <w:p>
+                  <w:pPr>
+                    <w:spacing w:after="0" w:line="240" w:lineRule="auto"/>
+                    <w:rPr>
+                      <w:rFonts w:ascii="Times New Roman" w:eastAsia="Times New Roman" w:hAnsi="Times New Roman" w:cs="Times New Roman"/>
+                      <w:sz w:val="24"/>
+                      <w:szCs w:val="24"/>
+                      <w:lang w:val="en-AU" w:eastAsia="en-AU"/>
+                    </w:rPr>
+                  </w:pPr>
+                  <w:r>
+                    <w:rPr>
+                      <w:rFonts w:ascii="Times New Roman" w:eastAsia="Times New Roman" w:hAnsi="Times New Roman" w:cs="Times New Roman"/>
+                      <w:sz w:val="24"/>
+                      <w:szCs w:val="24"/>
+                      <w:lang w:val="en-AU" w:eastAsia="en-AU"/>
+                    </w:rPr>
+                    <w:t>Low-stock filtering works</w:t>
+                  </w:r>
+                </w:p>
+              </w:tc>
+            </w:tr>
+            <w:tr>
+              <w:trPr>
+                <w:tblCellSpacing w:w="15" w:type="dxa"/>
+              </w:trPr>
+              <w:tc>
+                <w:tcPr>
+                  <w:tcW w:w="4951" w:type="dxa"/>
+                  <w:vAlign w:val="center"/>
+                  <w:hideMark/>
+                </w:tcPr>
+                <w:p>
+                  <w:pPr>
+                    <w:spacing w:after="0" w:line="240" w:lineRule="auto"/>
+                    <w:rPr>
+                      <w:rFonts w:ascii="Times New Roman" w:eastAsia="Times New Roman" w:hAnsi="Times New Roman" w:cs="Times New Roman"/>
+                      <w:sz w:val="24"/>
+                      <w:szCs w:val="24"/>
+                      <w:lang w:val="en-AU" w:eastAsia="en-AU"/>
+                    </w:rPr>
+                  </w:pPr>
+                  <w:proofErr w:type="spellStart"/>
+                  <w:r>
+                    <w:rPr>
+                      <w:rFonts w:ascii="Courier New" w:eastAsia="Times New Roman" w:hAnsi="Courier New" w:cs="Courier New"/>
+                      <w:sz w:val="20"/>
+                      <w:szCs w:val="20"/>
+                      <w:lang w:val="en-AU" w:eastAsia="en-AU"/>
+                    </w:rPr>
+                    <w:t>find_inventory_</w:t>
+                  </w:r>
+                  <w:proofErr w:type="gramStart"/>
+                  <w:r>
+                    <w:rPr>
+                      <w:rFonts w:ascii="Courier New" w:eastAsia="Times New Roman" w:hAnsi="Courier New" w:cs="Courier New"/>
+                      <w:sz w:val="20"/>
+                      <w:szCs w:val="20"/>
+                      <w:lang w:val="en-AU" w:eastAsia="en-AU"/>
+                    </w:rPr>
+                    <w:t>item</w:t>
+                  </w:r>
+                  <w:proofErr w:type="spellEnd"/>
+                  <w:r>
+                    <w:rPr>
+                      <w:rFonts w:ascii="Courier New" w:eastAsia="Times New Roman" w:hAnsi="Courier New" w:cs="Courier New"/>
+                      <w:sz w:val="20"/>
+                      <w:szCs w:val="20"/>
+                      <w:lang w:val="en-AU" w:eastAsia="en-AU"/>
+                    </w:rPr>
+                    <w:t>(</w:t>
+                  </w:r>
+                  <w:proofErr w:type="gramEnd"/>
+                  <w:r>
+                    <w:rPr>
+                      <w:rFonts w:ascii="Courier New" w:eastAsia="Times New Roman" w:hAnsi="Courier New" w:cs="Courier New"/>
+                      <w:sz w:val="20"/>
+                      <w:szCs w:val="20"/>
+                      <w:lang w:val="en-AU" w:eastAsia="en-AU"/>
+                    </w:rPr>
+                    <w:t>)</w:t>
+                  </w:r>
+                </w:p>
+              </w:tc>
+              <w:tc>
+                <w:tcPr>
+                  <w:tcW w:w="4130" w:type="dxa"/>
+                  <w:vAlign w:val="center"/>
+                  <w:hideMark/>
+                </w:tcPr>
+                <w:p>
+                  <w:pPr>
+                    <w:spacing w:after="0" w:line="240" w:lineRule="auto"/>
+                    <w:rPr>
+                      <w:rFonts w:ascii="Times New Roman" w:eastAsia="Times New Roman" w:hAnsi="Times New Roman" w:cs="Times New Roman"/>
+                      <w:sz w:val="24"/>
+                      <w:szCs w:val="24"/>
+                      <w:lang w:val="en-AU" w:eastAsia="en-AU"/>
+                    </w:rPr>
+                  </w:pPr>
+                  <w:r>
+                    <w:rPr>
+                      <w:rFonts w:ascii="Times New Roman" w:eastAsia="Times New Roman" w:hAnsi="Times New Roman" w:cs="Times New Roman"/>
+                      <w:sz w:val="24"/>
+                      <w:szCs w:val="24"/>
+                      <w:lang w:val="en-AU" w:eastAsia="en-AU"/>
+                    </w:rPr>
+                    <w:t>Inventory search works</w:t>
+                  </w:r>
+                </w:p>
+              </w:tc>
+            </w:tr>
+            <w:tr>
+              <w:trPr>
+                <w:tblCellSpacing w:w="15" w:type="dxa"/>
+              </w:trPr>
+              <w:tc>
+                <w:tcPr>
+                  <w:tcW w:w="4951" w:type="dxa"/>
+                  <w:vAlign w:val="center"/>
+                  <w:hideMark/>
+                </w:tcPr>
+                <w:p>
+                  <w:pPr>
+                    <w:spacing w:after="0" w:line="240" w:lineRule="auto"/>
+                    <w:rPr>
+                      <w:rFonts w:ascii="Times New Roman" w:eastAsia="Times New Roman" w:hAnsi="Times New Roman" w:cs="Times New Roman"/>
+                      <w:sz w:val="24"/>
+                      <w:szCs w:val="24"/>
+                      <w:lang w:val="en-AU" w:eastAsia="en-AU"/>
+                    </w:rPr>
+                  </w:pPr>
+                  <w:proofErr w:type="spellStart"/>
+                  <w:r>
+                    <w:rPr>
+                      <w:rFonts w:ascii="Courier New" w:eastAsia="Times New Roman" w:hAnsi="Courier New" w:cs="Courier New"/>
+                      <w:sz w:val="20"/>
+                      <w:szCs w:val="20"/>
+                      <w:lang w:val="en-AU" w:eastAsia="en-AU"/>
+                    </w:rPr>
+                    <w:t>summarise_intake_</w:t>
+                  </w:r>
+                  <w:proofErr w:type="gramStart"/>
+                  <w:r>
+                    <w:rPr>
+                      <w:rFonts w:ascii="Courier New" w:eastAsia="Times New Roman" w:hAnsi="Courier New" w:cs="Courier New"/>
+                      <w:sz w:val="20"/>
+                      <w:szCs w:val="20"/>
+                      <w:lang w:val="en-AU" w:eastAsia="en-AU"/>
+                    </w:rPr>
+                    <w:t>day</w:t>
+                  </w:r>
+                  <w:proofErr w:type="spellEnd"/>
+                  <w:r>
+                    <w:rPr>
+                      <w:rFonts w:ascii="Courier New" w:eastAsia="Times New Roman" w:hAnsi="Courier New" w:cs="Courier New"/>
+                      <w:sz w:val="20"/>
+                      <w:szCs w:val="20"/>
+                      <w:lang w:val="en-AU" w:eastAsia="en-AU"/>
+                    </w:rPr>
+                    <w:t>(</w:t>
+                  </w:r>
+                  <w:proofErr w:type="gramEnd"/>
+                  <w:r>
+                    <w:rPr>
+                      <w:rFonts w:ascii="Courier New" w:eastAsia="Times New Roman" w:hAnsi="Courier New" w:cs="Courier New"/>
+                      <w:sz w:val="20"/>
+                      <w:szCs w:val="20"/>
+                      <w:lang w:val="en-AU" w:eastAsia="en-AU"/>
+                    </w:rPr>
+                    <w:t>)</w:t>
+                  </w:r>
+                </w:p>
+              </w:tc>
+              <w:tc>
+                <w:tcPr>
+                  <w:tcW w:w="4130" w:type="dxa"/>
+                  <w:vAlign w:val="center"/>
+                  <w:hideMark/>
+                </w:tcPr>
+                <w:p>
+                  <w:pPr>
+                    <w:spacing w:after="0" w:line="240" w:lineRule="auto"/>
+                    <w:rPr>
+                      <w:rFonts w:ascii="Times New Roman" w:eastAsia="Times New Roman" w:hAnsi="Times New Roman" w:cs="Times New Roman"/>
+                      <w:sz w:val="24"/>
+                      <w:szCs w:val="24"/>
+                      <w:lang w:val="en-AU" w:eastAsia="en-AU"/>
+                    </w:rPr>
+                  </w:pPr>
+                  <w:r>
+                    <w:rPr>
+                      <w:rFonts w:ascii="Times New Roman" w:eastAsia="Times New Roman" w:hAnsi="Times New Roman" w:cs="Times New Roman"/>
+                      <w:sz w:val="24"/>
+                      <w:szCs w:val="24"/>
+                      <w:lang w:val="en-AU" w:eastAsia="en-AU"/>
+                    </w:rPr>
+                    <w:t>Intake summary returns expected structure</w:t>
+                  </w:r>
+                </w:p>
+              </w:tc>
+            </w:tr>
+          </w:tbl>
+          <w:p/>
+          <w:p>
+            <w:pPr>
+              <w:rPr>
+                <w:b/>
+                <w:bCs/>
+              </w:rPr>
+            </w:pPr>
+          </w:p>
+          <w:p>
+            <w:pPr>
+              <w:rPr>
+                <w:b/>
+                <w:bCs/>
+              </w:rPr>
+            </w:pPr>
+            <w:r>
+              <w:rPr>
+                <w:b/>
+                <w:bCs/>
+              </w:rPr>
+              <w:t>test_resource_payloads.py</w:t>
+            </w:r>
+          </w:p>
+          <w:p>
+            <w:r>
+              <w:t xml:space="preserve">Can </w:t>
+            </w:r>
+            <w:proofErr w:type="spellStart"/>
+            <w:proofErr w:type="gramStart"/>
+            <w:r>
+              <w:t>json.loads</w:t>
+            </w:r>
+            <w:proofErr w:type="spellEnd"/>
+            <w:proofErr w:type="gramEnd"/>
+            <w:r>
+              <w:t>() parse it?</w:t>
+            </w:r>
+          </w:p>
+          <w:p>
+            <w:r>
+              <w:t>Does it include resource name?</w:t>
+            </w:r>
+          </w:p>
+          <w:p>
+            <w:r>
+              <w:t xml:space="preserve">Does it include </w:t>
+            </w:r>
+            <w:proofErr w:type="spellStart"/>
+            <w:r>
+              <w:t>source_file</w:t>
+            </w:r>
+            <w:proofErr w:type="spellEnd"/>
+            <w:r>
+              <w:t>?</w:t>
+            </w:r>
+          </w:p>
+          <w:p>
+            <w:r>
+              <w:t xml:space="preserve">Does it include </w:t>
+            </w:r>
+            <w:proofErr w:type="spellStart"/>
+            <w:r>
+              <w:t>row_count</w:t>
+            </w:r>
+            <w:proofErr w:type="spellEnd"/>
+            <w:r>
+              <w:t>?</w:t>
+            </w:r>
+          </w:p>
+          <w:p>
+            <w:r>
+              <w:t>Does it include rows?</w:t>
+            </w:r>
+          </w:p>
+          <w:p>
+            <w:proofErr w:type="gramStart"/>
+            <w:r>
+              <w:t>Is</w:t>
+            </w:r>
+            <w:proofErr w:type="gramEnd"/>
+            <w:r>
+              <w:t xml:space="preserve"> rows a list?</w:t>
+            </w:r>
+          </w:p>
+          <w:p/>
+          <w:p>
+            <w:r>
+              <w:t>When a resource returns inventory data, is it valid JSON?</w:t>
+            </w:r>
+          </w:p>
+          <w:p>
+            <w:r>
+              <w:t>When a resource returns intake history, is it valid JSON?</w:t>
+            </w:r>
+          </w:p>
+          <w:p>
+            <w:r>
+              <w:t>When a resource returns intake items, is it valid JSON?</w:t>
+            </w:r>
+          </w:p>
+          <w:p>
+            <w:r>
+              <w:t>Are resource outputs consistent enough for an MCP client or LLM to use?</w:t>
+            </w:r>
+          </w:p>
+          <w:p/>
+          <w:p>
+            <w:pPr>
+              <w:rPr>
+                <w:b/>
+                <w:bCs/>
+              </w:rPr>
+            </w:pPr>
+            <w:r>
+              <w:rPr>
+                <w:b/>
+                <w:bCs/>
+              </w:rPr>
+              <w:t>test_logging_config.py</w:t>
+            </w:r>
+          </w:p>
+          <w:p>
+            <w:proofErr w:type="spellStart"/>
+            <w:r>
+              <w:t>configure_</w:t>
+            </w:r>
+            <w:proofErr w:type="gramStart"/>
+            <w:r>
+              <w:t>logging</w:t>
+            </w:r>
+            <w:proofErr w:type="spellEnd"/>
+            <w:r>
+              <w:t>(</w:t>
+            </w:r>
+            <w:proofErr w:type="gramEnd"/>
+            <w:r>
+              <w:t>) can run safely</w:t>
+            </w:r>
+          </w:p>
+          <w:p>
+            <w:proofErr w:type="gramStart"/>
+            <w:r>
+              <w:t>the logs</w:t>
+            </w:r>
+            <w:proofErr w:type="gramEnd"/>
+            <w:r>
+              <w:t xml:space="preserve"> folder exists</w:t>
+            </w:r>
+          </w:p>
+          <w:p>
+            <w:proofErr w:type="gramStart"/>
+            <w:r>
+              <w:lastRenderedPageBreak/>
+              <w:t>log</w:t>
+            </w:r>
+            <w:proofErr w:type="gramEnd"/>
+            <w:r>
+              <w:t xml:space="preserve"> files are created</w:t>
+            </w:r>
+          </w:p>
+          <w:p>
+            <w:r>
+              <w:t>missing CSV files produce a warning log</w:t>
+            </w:r>
+          </w:p>
+          <w:p/>
+          <w:p>
+            <w:r>
+              <w:drawing>
+                <wp:inline distT="0" distB="0" distL="0" distR="0" wp14:anchorId="76DABDAC" wp14:editId="40AB686B">
+                  <wp:extent cx="7064375" cy="774700"/>
+                  <wp:effectExtent l="0" t="0" r="3175" b="6350"/>
+                  <wp:docPr id="154558202" name="Picture 1"/>
+                  <wp:cNvGraphicFramePr>
+                    <a:graphicFrameLocks xmlns:a="http://schemas.openxmlformats.org/drawingml/2006/main" noChangeAspect="1"/>
+                  </wp:cNvGraphicFramePr>
+                  <a:graphic xmlns:a="http://schemas.openxmlformats.org/drawingml/2006/main">
+                    <a:graphicData uri="http://schemas.openxmlformats.org/drawingml/2006/picture">
+                      <pic:pic xmlns:pic="http://schemas.openxmlformats.org/drawingml/2006/picture">
+                        <pic:nvPicPr>
+                          <pic:cNvPr id="154558202" name=""/>
+                          <pic:cNvPicPr/>
+                        </pic:nvPicPr>
+                        <pic:blipFill>
+                          <a:blip r:embed="rId9"/>
+                          <a:stretch>
+                            <a:fillRect/>
+                          </a:stretch>
+                        </pic:blipFill>
+                        <pic:spPr>
+                          <a:xfrm>
+                            <a:off x="0" y="0"/>
+                            <a:ext cx="7064375" cy="774700"/>
+                          </a:xfrm>
+                          <a:prstGeom prst="rect">
+                            <a:avLst/>
+                          </a:prstGeom>
+                        </pic:spPr>
+                      </pic:pic>
+                    </a:graphicData>
+                  </a:graphic>
+                </wp:inline>
+              </w:drawing>
+            </w:r>
+          </w:p>
+          <w:p/>
+        </w:tc>
+      </w:tr>
+      <w:tr>
+        <w:tc>
+          <w:tcPr>
+            <w:tcW w:w="851" w:type="dxa"/>
+          </w:tcPr>
+          <w:p>
+            <w:r>
+              <w:lastRenderedPageBreak/>
+              <w:t>1</w:t>
+            </w:r>
+            <w:r>
+              <w:t>1</w:t>
+            </w:r>
+            <w:r>
+              <w:t>/05</w:t>
             </w:r>
           </w:p>
         </w:tc>
         <w:tc>
           <w:tcPr>
-            <w:tcW w:w="3260" w:type="dxa"/>
+            <w:tcW w:w="1276" w:type="dxa"/>
+            <w:gridSpan w:val="2"/>
           </w:tcPr>
           <w:p>
             <w:r>
-              <w:t>Modules not found when importing .py files</w:t>
-            </w:r>
-            <w:r>
-              <w:t xml:space="preserve"> when running stdio.py.</w:t>
+              <w:t>Tool setup</w:t>
             </w:r>
           </w:p>
         </w:tc>
         <w:tc>
           <w:tcPr>
-            <w:tcW w:w="2552" w:type="dxa"/>
+            <w:tcW w:w="992" w:type="dxa"/>
           </w:tcPr>
           <w:p>
             <w:r>
-              <w:t xml:space="preserve">Used init files and folder structure setup. Deleting cashe </w:t>
+              <w:t>Which tools are required for my purpose</w:t>
             </w:r>
           </w:p>
         </w:tc>
         <w:tc>
           <w:tcPr>
-            <w:tcW w:w="1134" w:type="dxa"/>
+            <w:tcW w:w="2835" w:type="dxa"/>
+          </w:tcPr>
+          <w:p>
+            <w:r>
+              <w:t>Task is more complex than I originally thought and many basic tools are required first.</w:t>
+            </w:r>
+            <w:r>
+              <w:t xml:space="preserve"> Searching, reading, writing and summarizing user inventory and user intake basic and most important to start with. </w:t>
+            </w:r>
+          </w:p>
+          <w:p>
+            <w:r>
+              <w:t xml:space="preserve"> </w:t>
+            </w:r>
+            <w:r>
+              <w:t>Start with only read tools</w:t>
+            </w:r>
+          </w:p>
+        </w:tc>
+        <w:tc>
+          <w:tcPr>
+            <w:tcW w:w="3828" w:type="dxa"/>
+          </w:tcPr>
+          <w:p>
+            <w:r>
+              <w:t>Start with most practical tools</w:t>
+            </w:r>
+            <w:r>
+              <w:t xml:space="preserve">. </w:t>
+            </w:r>
+          </w:p>
+          <w:p>
+            <w:pPr>
+              <w:rPr>
+                <w:u w:val="single"/>
+              </w:rPr>
+            </w:pPr>
+            <w:r>
+              <w:rPr>
+                <w:u w:val="single"/>
+              </w:rPr>
+              <w:t xml:space="preserve">Tool 1: </w:t>
+            </w:r>
+            <w:proofErr w:type="spellStart"/>
+            <w:r>
+              <w:rPr>
+                <w:u w:val="single"/>
+              </w:rPr>
+              <w:t>search_inventory</w:t>
+            </w:r>
+            <w:proofErr w:type="spellEnd"/>
+          </w:p>
+          <w:p>
+            <w:pPr>
+              <w:pStyle w:val="ListParagraph"/>
+              <w:numPr>
+                <w:ilvl w:val="0"/>
+                <w:numId w:val="11"/>
+              </w:numPr>
+            </w:pPr>
+            <w:r>
+              <w:t xml:space="preserve">Searches </w:t>
+            </w:r>
+            <w:r>
+              <w:t>user_inventory.csv</w:t>
+            </w:r>
+          </w:p>
+          <w:p>
+            <w:pPr>
+              <w:pStyle w:val="ListParagraph"/>
+              <w:numPr>
+                <w:ilvl w:val="0"/>
+                <w:numId w:val="11"/>
+              </w:numPr>
+            </w:pPr>
+            <w:r>
+              <w:t>Find food by name/category/location</w:t>
+            </w:r>
+          </w:p>
+          <w:p>
+            <w:pPr>
+              <w:rPr>
+                <w:u w:val="single"/>
+              </w:rPr>
+            </w:pPr>
+            <w:r>
+              <w:rPr>
+                <w:u w:val="single"/>
+              </w:rPr>
+              <w:t xml:space="preserve">Tool 2: </w:t>
+            </w:r>
+            <w:proofErr w:type="spellStart"/>
+            <w:r>
+              <w:rPr>
+                <w:u w:val="single"/>
+              </w:rPr>
+              <w:t>get_</w:t>
+            </w:r>
+            <w:r>
+              <w:rPr>
+                <w:u w:val="single"/>
+              </w:rPr>
+              <w:t>recent_intake</w:t>
+            </w:r>
+            <w:proofErr w:type="spellEnd"/>
+          </w:p>
+          <w:p>
+            <w:pPr>
+              <w:pStyle w:val="ListParagraph"/>
+              <w:numPr>
+                <w:ilvl w:val="0"/>
+                <w:numId w:val="11"/>
+              </w:numPr>
+            </w:pPr>
+            <w:r>
+              <w:t xml:space="preserve">Searches </w:t>
+            </w:r>
+            <w:r>
+              <w:t>user_inventory.csv</w:t>
+            </w:r>
+          </w:p>
+          <w:p>
+            <w:pPr>
+              <w:pStyle w:val="ListParagraph"/>
+              <w:numPr>
+                <w:ilvl w:val="0"/>
+                <w:numId w:val="11"/>
+              </w:numPr>
+              <w:rPr>
+                <w:u w:val="single"/>
+              </w:rPr>
+            </w:pPr>
+            <w:r>
+              <w:t>Find items that need replacing</w:t>
+            </w:r>
+          </w:p>
+          <w:p>
+            <w:pPr>
+              <w:pStyle w:val="ListParagraph"/>
+              <w:numPr>
+                <w:ilvl w:val="0"/>
+                <w:numId w:val="11"/>
+              </w:numPr>
+              <w:rPr>
+                <w:u w:val="single"/>
+              </w:rPr>
+            </w:pPr>
+          </w:p>
+        </w:tc>
+        <w:tc>
+          <w:tcPr>
+            <w:tcW w:w="1559" w:type="dxa"/>
+          </w:tcPr>
+          <w:p>
+            <w:r>
+              <w:t>Building up project in versions starting with version 1 which is read only tools.</w:t>
+            </w:r>
+          </w:p>
+        </w:tc>
+      </w:tr>
+      <w:tr>
+        <w:tc>
+          <w:tcPr>
+            <w:tcW w:w="851" w:type="dxa"/>
+          </w:tcPr>
+          <w:p>
+            <w:r>
+              <w:t>11/05</w:t>
+            </w:r>
+          </w:p>
+        </w:tc>
+        <w:tc>
+          <w:tcPr>
+            <w:tcW w:w="1276" w:type="dxa"/>
+            <w:gridSpan w:val="2"/>
+          </w:tcPr>
+          <w:p>
+            <w:r>
+              <w:t>Tool 1 – search_inventory.py</w:t>
+            </w:r>
+          </w:p>
+        </w:tc>
+        <w:tc>
+          <w:tcPr>
+            <w:tcW w:w="992" w:type="dxa"/>
+          </w:tcPr>
+          <w:p>
+            <w:r>
+              <w:t>Create searching user inventory tool</w:t>
+            </w:r>
+          </w:p>
+        </w:tc>
+        <w:tc>
+          <w:tcPr>
+            <w:tcW w:w="2835" w:type="dxa"/>
+          </w:tcPr>
+          <w:p>
+            <w:r>
+              <w:t xml:space="preserve">Error occurring with </w:t>
+            </w:r>
+            <w:proofErr w:type="spellStart"/>
+            <w:r>
+              <w:t>mcp</w:t>
+            </w:r>
+            <w:proofErr w:type="spellEnd"/>
+            <w:r>
+              <w:t xml:space="preserve"> inspector showing that I have not made the pre-defined function code within my core/grocery_service.py setup. </w:t>
+            </w:r>
+          </w:p>
+        </w:tc>
+        <w:tc>
+          <w:tcPr>
+            <w:tcW w:w="3828" w:type="dxa"/>
+          </w:tcPr>
+          <w:p>
+            <w:r>
+              <w:t>Added the hidden search_inventory.py brain code inside core/grocery_service.py as def search inventory</w:t>
+            </w:r>
+          </w:p>
+        </w:tc>
+        <w:tc>
+          <w:tcPr>
+            <w:tcW w:w="1559" w:type="dxa"/>
+          </w:tcPr>
+          <w:p>
+            <w:r>
+              <w:t>Feature-tools branch</w:t>
+            </w:r>
+          </w:p>
+          <w:p>
+            <w:pPr>
+              <w:rPr>
+                <w:lang w:val="en-AU"/>
+              </w:rPr>
+            </w:pPr>
+            <w:r>
+              <w:rPr>
+                <w:lang w:val="en-AU"/>
+              </w:rPr>
+              <w:t xml:space="preserve">tool 1 search inventory implemented and </w:t>
+            </w:r>
+            <w:proofErr w:type="spellStart"/>
+            <w:r>
+              <w:rPr>
+                <w:lang w:val="en-AU"/>
+              </w:rPr>
+              <w:t>mcp</w:t>
+            </w:r>
+            <w:proofErr w:type="spellEnd"/>
+            <w:r>
+              <w:rPr>
+                <w:lang w:val="en-AU"/>
+              </w:rPr>
+              <w:t xml:space="preserve"> inspector test passed</w:t>
+            </w:r>
+          </w:p>
+          <w:p/>
+        </w:tc>
+      </w:tr>
+      <w:tr>
+        <w:tc>
+          <w:tcPr>
+            <w:tcW w:w="851" w:type="dxa"/>
+          </w:tcPr>
+          <w:p>
+            <w:r>
+              <w:t>11/05</w:t>
+            </w:r>
+          </w:p>
+        </w:tc>
+        <w:tc>
+          <w:tcPr>
+            <w:tcW w:w="1276" w:type="dxa"/>
+            <w:gridSpan w:val="2"/>
+          </w:tcPr>
+          <w:p>
+            <w:r>
+              <w:t xml:space="preserve">Tool 2: </w:t>
+            </w:r>
+            <w:proofErr w:type="spellStart"/>
+            <w:r>
+              <w:t>get_</w:t>
+            </w:r>
+            <w:r>
+              <w:t>recent_intake</w:t>
+            </w:r>
+            <w:proofErr w:type="spellEnd"/>
+          </w:p>
+        </w:tc>
+        <w:tc>
+          <w:tcPr>
+            <w:tcW w:w="992" w:type="dxa"/>
+          </w:tcPr>
+          <w:p>
+            <w:r>
+              <w:t xml:space="preserve">Create get </w:t>
+            </w:r>
+            <w:r>
+              <w:t>recent intake tool</w:t>
+            </w:r>
+          </w:p>
+        </w:tc>
+        <w:tc>
+          <w:tcPr>
+            <w:tcW w:w="2835" w:type="dxa"/>
+          </w:tcPr>
+          <w:p>
+            <w:proofErr w:type="spellStart"/>
+            <w:r>
+              <w:t>Mcp</w:t>
+            </w:r>
+            <w:proofErr w:type="spellEnd"/>
+            <w:r>
+              <w:t xml:space="preserve"> inspector </w:t>
+            </w:r>
+            <w:proofErr w:type="gramStart"/>
+            <w:r>
+              <w:t>wont</w:t>
+            </w:r>
+            <w:proofErr w:type="gramEnd"/>
+            <w:r>
+              <w:t xml:space="preserve"> connect to </w:t>
+            </w:r>
+            <w:proofErr w:type="spellStart"/>
+            <w:r>
+              <w:t>stdio</w:t>
+            </w:r>
+            <w:proofErr w:type="spellEnd"/>
+            <w:r>
+              <w:t xml:space="preserve"> server</w:t>
+            </w:r>
+          </w:p>
+        </w:tc>
+        <w:tc>
+          <w:tcPr>
+            <w:tcW w:w="3828" w:type="dxa"/>
+          </w:tcPr>
+          <w:p>
+            <w:r>
+              <w:t xml:space="preserve">Didn’t save the files and so the inspector wasn’t reading the updated code within </w:t>
+            </w:r>
+            <w:proofErr w:type="spellStart"/>
+            <w:r>
+              <w:t>grocery_service</w:t>
+            </w:r>
+            <w:proofErr w:type="spellEnd"/>
+            <w:r>
+              <w:t>, mcp_tools/intake_tools.py and mcp_tools/register.py</w:t>
+            </w:r>
+          </w:p>
+        </w:tc>
+        <w:tc>
+          <w:tcPr>
+            <w:tcW w:w="1559" w:type="dxa"/>
+          </w:tcPr>
+          <w:p>
+            <w:r>
+              <w:t>Feature-tools branch</w:t>
+            </w:r>
+          </w:p>
+          <w:p>
+            <w:pPr>
+              <w:rPr>
+                <w:lang w:val="en-AU"/>
+              </w:rPr>
+            </w:pPr>
+            <w:r>
+              <w:rPr>
+                <w:lang w:val="en-AU"/>
+              </w:rPr>
+              <w:t>tool 2 get recent intake implemented and tested</w:t>
+            </w:r>
+          </w:p>
+          <w:p/>
+        </w:tc>
+      </w:tr>
+      <w:tr>
+        <w:tc>
+          <w:tcPr>
+            <w:tcW w:w="11341" w:type="dxa"/>
+            <w:gridSpan w:val="7"/>
+          </w:tcPr>
+          <w:p/>
+          <w:p/>
+          <w:p/>
+          <w:p>
+            <w:pPr>
+              <w:rPr>
+                <w:b/>
+                <w:bCs/>
+              </w:rPr>
+            </w:pPr>
+            <w:proofErr w:type="gramStart"/>
+            <w:r>
+              <w:rPr>
+                <w:b/>
+                <w:bCs/>
+              </w:rPr>
+              <w:t>Calculates</w:t>
+            </w:r>
+            <w:proofErr w:type="gramEnd"/>
+            <w:r>
+              <w:rPr>
+                <w:b/>
+                <w:bCs/>
+              </w:rPr>
+              <w:t>:</w:t>
+            </w:r>
+          </w:p>
+          <w:p>
+            <w:proofErr w:type="spellStart"/>
+            <w:r>
+              <w:t>meal_count</w:t>
+            </w:r>
+            <w:proofErr w:type="spellEnd"/>
+          </w:p>
+          <w:p>
+            <w:proofErr w:type="spellStart"/>
+            <w:r>
+              <w:t>item_count</w:t>
+            </w:r>
+            <w:proofErr w:type="spellEnd"/>
+          </w:p>
+          <w:p>
+            <w:proofErr w:type="spellStart"/>
+            <w:r>
+              <w:t>nutrition_totals</w:t>
+            </w:r>
+            <w:proofErr w:type="spellEnd"/>
+          </w:p>
+          <w:p>
+            <w:proofErr w:type="spellStart"/>
+            <w:r>
+              <w:t>missing_nutrition_counts</w:t>
+            </w:r>
+            <w:proofErr w:type="spellEnd"/>
+          </w:p>
+          <w:p/>
+          <w:p>
+            <w:pPr>
+              <w:rPr>
+                <w:b/>
+                <w:bCs/>
+              </w:rPr>
+            </w:pPr>
+            <w:r>
+              <w:rPr>
+                <w:b/>
+                <w:bCs/>
+              </w:rPr>
+              <w:t>Returns:</w:t>
+            </w:r>
+          </w:p>
+          <w:p>
+            <w:r>
+              <w:t>structured dictionary of meals, items, and totals</w:t>
+            </w:r>
+          </w:p>
+          <w:p/>
+          <w:p>
+            <w:pPr>
+              <w:rPr>
+                <w:b/>
+                <w:bCs/>
+              </w:rPr>
+            </w:pPr>
+            <w:r>
+              <w:rPr>
+                <w:b/>
+                <w:bCs/>
+              </w:rPr>
+              <w:t>Does not:</w:t>
+            </w:r>
+          </w:p>
+          <w:p>
+            <w:proofErr w:type="gramStart"/>
+            <w:r>
+              <w:t>write</w:t>
+            </w:r>
+            <w:proofErr w:type="gramEnd"/>
+            <w:r>
+              <w:t xml:space="preserve"> to CSV</w:t>
+            </w:r>
+          </w:p>
+          <w:p>
+            <w:r>
+              <w:t>estimate missing nutrition</w:t>
+            </w:r>
+          </w:p>
+          <w:p>
+            <w:r>
+              <w:t>judge health quality</w:t>
+            </w:r>
+          </w:p>
+          <w:p>
+            <w:r>
+              <w:t>recommend meals</w:t>
+            </w:r>
+          </w:p>
+          <w:p/>
+          <w:p>
+            <w:pPr>
+              <w:rPr>
+                <w:b/>
+                <w:bCs/>
+              </w:rPr>
+            </w:pPr>
+            <w:r>
+              <w:rPr>
+                <w:b/>
+                <w:bCs/>
+              </w:rPr>
+              <w:t>how</w:t>
+            </w:r>
+          </w:p>
+          <w:p>
+            <w:r>
+              <w:t xml:space="preserve">updated </w:t>
+            </w:r>
+            <w:proofErr w:type="spellStart"/>
+            <w:r>
+              <w:t>inta</w:t>
+            </w:r>
+            <w:r>
+              <w:t>ke_tools</w:t>
+            </w:r>
+            <w:proofErr w:type="spellEnd"/>
+            <w:r>
+              <w:t xml:space="preserve"> with </w:t>
+            </w:r>
+            <w:proofErr w:type="spellStart"/>
+            <w:r>
+              <w:t>get_daily_intake_summary</w:t>
+            </w:r>
+            <w:proofErr w:type="spellEnd"/>
+            <w:r>
+              <w:t xml:space="preserve"> and updated </w:t>
+            </w:r>
+            <w:proofErr w:type="spellStart"/>
+            <w:r>
+              <w:t>grocery_services</w:t>
+            </w:r>
+            <w:proofErr w:type="spellEnd"/>
+            <w:r>
+              <w:t xml:space="preserve"> </w:t>
+            </w:r>
+          </w:p>
+          <w:p>
+            <w:pPr>
+              <w:rPr>
+                <w:b/>
+                <w:bCs/>
+              </w:rPr>
+            </w:pPr>
+            <w:r>
+              <w:rPr>
+                <w:b/>
+                <w:bCs/>
+              </w:rPr>
+              <w:t>evidence</w:t>
+            </w:r>
+          </w:p>
+          <w:p>
+            <w:pPr>
+              <w:rPr>
+                <w:b/>
+                <w:bCs/>
+              </w:rPr>
+            </w:pPr>
+          </w:p>
+        </w:tc>
+      </w:tr>
+      <w:tr>
+        <w:tc>
+          <w:tcPr>
+            <w:tcW w:w="11341" w:type="dxa"/>
+            <w:gridSpan w:val="7"/>
+          </w:tcPr>
+          <w:p/>
+        </w:tc>
+      </w:tr>
+      <w:tr>
+        <w:tc>
+          <w:tcPr>
+            <w:tcW w:w="851" w:type="dxa"/>
+          </w:tcPr>
+          <w:p>
+            <w:r>
+              <w:lastRenderedPageBreak/>
+              <w:t>11/05</w:t>
+            </w:r>
+          </w:p>
+        </w:tc>
+        <w:tc>
+          <w:tcPr>
+            <w:tcW w:w="993" w:type="dxa"/>
+          </w:tcPr>
+          <w:p>
+            <w:r>
+              <w:t xml:space="preserve">Tool </w:t>
+            </w:r>
+            <w:r>
+              <w:t>3</w:t>
+            </w:r>
+            <w:r>
+              <w:t xml:space="preserve">: </w:t>
+            </w:r>
+            <w:proofErr w:type="spellStart"/>
+            <w:r>
+              <w:t>get_daily_intake_summary</w:t>
+            </w:r>
+            <w:proofErr w:type="spellEnd"/>
+          </w:p>
+          <w:p/>
+        </w:tc>
+        <w:tc>
+          <w:tcPr>
+            <w:tcW w:w="1275" w:type="dxa"/>
+            <w:gridSpan w:val="2"/>
+          </w:tcPr>
+          <w:p>
+            <w:r>
+              <w:t xml:space="preserve">Create </w:t>
+            </w:r>
+            <w:proofErr w:type="spellStart"/>
+            <w:r>
+              <w:t>get_daily_intake_summary</w:t>
+            </w:r>
+            <w:proofErr w:type="spellEnd"/>
+            <w:r>
+              <w:t xml:space="preserve"> that can calculate the nutritional information </w:t>
+            </w:r>
+            <w:r>
+              <w:t>within a day</w:t>
+            </w:r>
+          </w:p>
+        </w:tc>
+        <w:tc>
+          <w:tcPr>
+            <w:tcW w:w="2835" w:type="dxa"/>
+          </w:tcPr>
+          <w:p>
+            <w:r>
+              <w:t>Tool nutrition calculation not accurately accounting for all appropriate items</w:t>
+            </w:r>
+          </w:p>
+        </w:tc>
+        <w:tc>
+          <w:tcPr>
+            <w:tcW w:w="3828" w:type="dxa"/>
+          </w:tcPr>
+          <w:p>
+            <w:pPr>
+              <w:rPr>
+                <w:lang w:val="en-AU"/>
+              </w:rPr>
+            </w:pPr>
+            <w:r>
+              <w:t xml:space="preserve">Updated grocery_service.py </w:t>
+            </w:r>
+            <w:proofErr w:type="spellStart"/>
+            <w:r>
+              <w:rPr>
+                <w:lang w:val="en-AU"/>
+              </w:rPr>
+              <w:t>get_daily_intake_summary</w:t>
+            </w:r>
+            <w:proofErr w:type="spellEnd"/>
+            <w:r>
+              <w:rPr>
+                <w:lang w:val="en-AU"/>
+              </w:rPr>
+              <w:t xml:space="preserve"> function to appropriate handle calculations</w:t>
+            </w:r>
+          </w:p>
+        </w:tc>
+        <w:tc>
+          <w:tcPr>
+            <w:tcW w:w="1559" w:type="dxa"/>
           </w:tcPr>
           <w:p/>
         </w:tc>
@@ -398,7 +3124,7 @@
     </w:tbl>
     <w:p/>
     <w:sectPr>
-      <w:headerReference w:type="default" r:id="rId8"/>
+      <w:headerReference w:type="default" r:id="rId10"/>
       <w:pgSz w:w="12240" w:h="15840"/>
       <w:pgMar w:top="1440" w:right="1800" w:bottom="1440" w:left="1800" w:header="720" w:footer="720" w:gutter="0"/>
       <w:cols w:space="720"/>
@@ -679,6 +3405,230 @@
       </w:rPr>
     </w:lvl>
   </w:abstractNum>
+  <w:abstractNum w:abstractNumId="9" w15:restartNumberingAfterBreak="0">
+    <w:nsid w:val="2E03596B"/>
+    <w:multiLevelType w:val="hybridMultilevel"/>
+    <w:tmpl w:val="B7C80742"/>
+    <w:lvl w:ilvl="0" w:tplc="2D00C0D8">
+      <w:numFmt w:val="bullet"/>
+      <w:lvlText w:val="-"/>
+      <w:lvlJc w:val="left"/>
+      <w:pPr>
+        <w:ind w:left="720" w:hanging="360"/>
+      </w:pPr>
+      <w:rPr>
+        <w:rFonts w:ascii="Cambria" w:eastAsiaTheme="minorEastAsia" w:hAnsi="Cambria" w:cstheme="minorBidi" w:hint="default"/>
+      </w:rPr>
+    </w:lvl>
+    <w:lvl w:ilvl="1" w:tplc="0C090003" w:tentative="1">
+      <w:start w:val="1"/>
+      <w:numFmt w:val="bullet"/>
+      <w:lvlText w:val="o"/>
+      <w:lvlJc w:val="left"/>
+      <w:pPr>
+        <w:ind w:left="1440" w:hanging="360"/>
+      </w:pPr>
+      <w:rPr>
+        <w:rFonts w:ascii="Courier New" w:hAnsi="Courier New" w:cs="Courier New" w:hint="default"/>
+      </w:rPr>
+    </w:lvl>
+    <w:lvl w:ilvl="2" w:tplc="0C090005" w:tentative="1">
+      <w:start w:val="1"/>
+      <w:numFmt w:val="bullet"/>
+      <w:lvlText w:val=""/>
+      <w:lvlJc w:val="left"/>
+      <w:pPr>
+        <w:ind w:left="2160" w:hanging="360"/>
+      </w:pPr>
+      <w:rPr>
+        <w:rFonts w:ascii="Wingdings" w:hAnsi="Wingdings" w:hint="default"/>
+      </w:rPr>
+    </w:lvl>
+    <w:lvl w:ilvl="3" w:tplc="0C090001" w:tentative="1">
+      <w:start w:val="1"/>
+      <w:numFmt w:val="bullet"/>
+      <w:lvlText w:val=""/>
+      <w:lvlJc w:val="left"/>
+      <w:pPr>
+        <w:ind w:left="2880" w:hanging="360"/>
+      </w:pPr>
+      <w:rPr>
+        <w:rFonts w:ascii="Symbol" w:hAnsi="Symbol" w:hint="default"/>
+      </w:rPr>
+    </w:lvl>
+    <w:lvl w:ilvl="4" w:tplc="0C090003" w:tentative="1">
+      <w:start w:val="1"/>
+      <w:numFmt w:val="bullet"/>
+      <w:lvlText w:val="o"/>
+      <w:lvlJc w:val="left"/>
+      <w:pPr>
+        <w:ind w:left="3600" w:hanging="360"/>
+      </w:pPr>
+      <w:rPr>
+        <w:rFonts w:ascii="Courier New" w:hAnsi="Courier New" w:cs="Courier New" w:hint="default"/>
+      </w:rPr>
+    </w:lvl>
+    <w:lvl w:ilvl="5" w:tplc="0C090005" w:tentative="1">
+      <w:start w:val="1"/>
+      <w:numFmt w:val="bullet"/>
+      <w:lvlText w:val=""/>
+      <w:lvlJc w:val="left"/>
+      <w:pPr>
+        <w:ind w:left="4320" w:hanging="360"/>
+      </w:pPr>
+      <w:rPr>
+        <w:rFonts w:ascii="Wingdings" w:hAnsi="Wingdings" w:hint="default"/>
+      </w:rPr>
+    </w:lvl>
+    <w:lvl w:ilvl="6" w:tplc="0C090001" w:tentative="1">
+      <w:start w:val="1"/>
+      <w:numFmt w:val="bullet"/>
+      <w:lvlText w:val=""/>
+      <w:lvlJc w:val="left"/>
+      <w:pPr>
+        <w:ind w:left="5040" w:hanging="360"/>
+      </w:pPr>
+      <w:rPr>
+        <w:rFonts w:ascii="Symbol" w:hAnsi="Symbol" w:hint="default"/>
+      </w:rPr>
+    </w:lvl>
+    <w:lvl w:ilvl="7" w:tplc="0C090003" w:tentative="1">
+      <w:start w:val="1"/>
+      <w:numFmt w:val="bullet"/>
+      <w:lvlText w:val="o"/>
+      <w:lvlJc w:val="left"/>
+      <w:pPr>
+        <w:ind w:left="5760" w:hanging="360"/>
+      </w:pPr>
+      <w:rPr>
+        <w:rFonts w:ascii="Courier New" w:hAnsi="Courier New" w:cs="Courier New" w:hint="default"/>
+      </w:rPr>
+    </w:lvl>
+    <w:lvl w:ilvl="8" w:tplc="0C090005" w:tentative="1">
+      <w:start w:val="1"/>
+      <w:numFmt w:val="bullet"/>
+      <w:lvlText w:val=""/>
+      <w:lvlJc w:val="left"/>
+      <w:pPr>
+        <w:ind w:left="6480" w:hanging="360"/>
+      </w:pPr>
+      <w:rPr>
+        <w:rFonts w:ascii="Wingdings" w:hAnsi="Wingdings" w:hint="default"/>
+      </w:rPr>
+    </w:lvl>
+  </w:abstractNum>
+  <w:abstractNum w:abstractNumId="10" w15:restartNumberingAfterBreak="0">
+    <w:nsid w:val="49FB573D"/>
+    <w:multiLevelType w:val="hybridMultilevel"/>
+    <w:tmpl w:val="F61C1188"/>
+    <w:lvl w:ilvl="0" w:tplc="8CF40FD6">
+      <w:numFmt w:val="bullet"/>
+      <w:lvlText w:val="-"/>
+      <w:lvlJc w:val="left"/>
+      <w:pPr>
+        <w:ind w:left="720" w:hanging="360"/>
+      </w:pPr>
+      <w:rPr>
+        <w:rFonts w:ascii="Cambria" w:eastAsiaTheme="minorEastAsia" w:hAnsi="Cambria" w:cstheme="minorBidi" w:hint="default"/>
+      </w:rPr>
+    </w:lvl>
+    <w:lvl w:ilvl="1" w:tplc="0C090003" w:tentative="1">
+      <w:start w:val="1"/>
+      <w:numFmt w:val="bullet"/>
+      <w:lvlText w:val="o"/>
+      <w:lvlJc w:val="left"/>
+      <w:pPr>
+        <w:ind w:left="1440" w:hanging="360"/>
+      </w:pPr>
+      <w:rPr>
+        <w:rFonts w:ascii="Courier New" w:hAnsi="Courier New" w:cs="Courier New" w:hint="default"/>
+      </w:rPr>
+    </w:lvl>
+    <w:lvl w:ilvl="2" w:tplc="0C090005" w:tentative="1">
+      <w:start w:val="1"/>
+      <w:numFmt w:val="bullet"/>
+      <w:lvlText w:val=""/>
+      <w:lvlJc w:val="left"/>
+      <w:pPr>
+        <w:ind w:left="2160" w:hanging="360"/>
+      </w:pPr>
+      <w:rPr>
+        <w:rFonts w:ascii="Wingdings" w:hAnsi="Wingdings" w:hint="default"/>
+      </w:rPr>
+    </w:lvl>
+    <w:lvl w:ilvl="3" w:tplc="0C090001" w:tentative="1">
+      <w:start w:val="1"/>
+      <w:numFmt w:val="bullet"/>
+      <w:lvlText w:val=""/>
+      <w:lvlJc w:val="left"/>
+      <w:pPr>
+        <w:ind w:left="2880" w:hanging="360"/>
+      </w:pPr>
+      <w:rPr>
+        <w:rFonts w:ascii="Symbol" w:hAnsi="Symbol" w:hint="default"/>
+      </w:rPr>
+    </w:lvl>
+    <w:lvl w:ilvl="4" w:tplc="0C090003" w:tentative="1">
+      <w:start w:val="1"/>
+      <w:numFmt w:val="bullet"/>
+      <w:lvlText w:val="o"/>
+      <w:lvlJc w:val="left"/>
+      <w:pPr>
+        <w:ind w:left="3600" w:hanging="360"/>
+      </w:pPr>
+      <w:rPr>
+        <w:rFonts w:ascii="Courier New" w:hAnsi="Courier New" w:cs="Courier New" w:hint="default"/>
+      </w:rPr>
+    </w:lvl>
+    <w:lvl w:ilvl="5" w:tplc="0C090005" w:tentative="1">
+      <w:start w:val="1"/>
+      <w:numFmt w:val="bullet"/>
+      <w:lvlText w:val=""/>
+      <w:lvlJc w:val="left"/>
+      <w:pPr>
+        <w:ind w:left="4320" w:hanging="360"/>
+      </w:pPr>
+      <w:rPr>
+        <w:rFonts w:ascii="Wingdings" w:hAnsi="Wingdings" w:hint="default"/>
+      </w:rPr>
+    </w:lvl>
+    <w:lvl w:ilvl="6" w:tplc="0C090001" w:tentative="1">
+      <w:start w:val="1"/>
+      <w:numFmt w:val="bullet"/>
+      <w:lvlText w:val=""/>
+      <w:lvlJc w:val="left"/>
+      <w:pPr>
+        <w:ind w:left="5040" w:hanging="360"/>
+      </w:pPr>
+      <w:rPr>
+        <w:rFonts w:ascii="Symbol" w:hAnsi="Symbol" w:hint="default"/>
+      </w:rPr>
+    </w:lvl>
+    <w:lvl w:ilvl="7" w:tplc="0C090003" w:tentative="1">
+      <w:start w:val="1"/>
+      <w:numFmt w:val="bullet"/>
+      <w:lvlText w:val="o"/>
+      <w:lvlJc w:val="left"/>
+      <w:pPr>
+        <w:ind w:left="5760" w:hanging="360"/>
+      </w:pPr>
+      <w:rPr>
+        <w:rFonts w:ascii="Courier New" w:hAnsi="Courier New" w:cs="Courier New" w:hint="default"/>
+      </w:rPr>
+    </w:lvl>
+    <w:lvl w:ilvl="8" w:tplc="0C090005" w:tentative="1">
+      <w:start w:val="1"/>
+      <w:numFmt w:val="bullet"/>
+      <w:lvlText w:val=""/>
+      <w:lvlJc w:val="left"/>
+      <w:pPr>
+        <w:ind w:left="6480" w:hanging="360"/>
+      </w:pPr>
+      <w:rPr>
+        <w:rFonts w:ascii="Wingdings" w:hAnsi="Wingdings" w:hint="default"/>
+      </w:rPr>
+    </w:lvl>
+  </w:abstractNum>
   <w:num w:numId="1" w16cid:durableId="983244199">
     <w:abstractNumId w:val="8"/>
   </w:num>
@@ -705,6 +3655,12 @@
   </w:num>
   <w:num w:numId="9" w16cid:durableId="1059481765">
     <w:abstractNumId w:val="0"/>
+  </w:num>
+  <w:num w:numId="10" w16cid:durableId="1650818364">
+    <w:abstractNumId w:val="10"/>
+  </w:num>
+  <w:num w:numId="11" w16cid:durableId="818765813">
+    <w:abstractNumId w:val="9"/>
   </w:num>
 </w:numbering>
 </file>
@@ -12088,6 +15044,19 @@
       </w:tcPr>
     </w:tblStylePr>
   </w:style>
+  <w:style w:type="character" w:styleId="HTMLCode">
+    <w:name w:val="HTML Code"/>
+    <w:basedOn w:val="DefaultParagraphFont"/>
+    <w:uiPriority w:val="99"/>
+    <w:semiHidden/>
+    <w:unhideWhenUsed/>
+    <w:rsid w:val="00551512"/>
+    <w:rPr>
+      <w:rFonts w:ascii="Courier New" w:eastAsia="Times New Roman" w:hAnsi="Courier New" w:cs="Courier New"/>
+      <w:sz w:val="20"/>
+      <w:szCs w:val="20"/>
+    </w:rPr>
+  </w:style>
 </w:styles>
 </file>
 

</xml_diff>